<commit_message>
Trabajo con mi parte
</commit_message>
<xml_diff>
--- a/word/Actividad.docx
+++ b/word/Actividad.docx
@@ -1,16 +1,16 @@
 
 <file path=word/document.xml><?xml version="1.0" encoding="utf-8"?>
-<w:document xmlns:wpc="http://schemas.microsoft.com/office/word/2010/wordprocessingCanvas" xmlns:cx="http://schemas.microsoft.com/office/drawing/2014/chartex" xmlns:cx1="http://schemas.microsoft.com/office/drawing/2015/9/8/chartex" xmlns:cx2="http://schemas.microsoft.com/office/drawing/2015/10/21/chartex" xmlns:cx3="http://schemas.microsoft.com/office/drawing/2016/5/9/chartex" xmlns:cx4="http://schemas.microsoft.com/office/drawing/2016/5/10/chartex" xmlns:cx5="http://schemas.microsoft.com/office/drawing/2016/5/11/chartex" xmlns:cx6="http://schemas.microsoft.com/office/drawing/2016/5/12/chartex" xmlns:cx7="http://schemas.microsoft.com/office/drawing/2016/5/13/chartex" xmlns:cx8="http://schemas.microsoft.com/office/drawing/2016/5/14/chartex" xmlns:mc="http://schemas.openxmlformats.org/markup-compatibility/2006" xmlns:aink="http://schemas.microsoft.com/office/drawing/2016/ink" xmlns:am3d="http://schemas.microsoft.com/office/drawing/2017/model3d" xmlns:o="urn:schemas-microsoft-com:office:office" xmlns:oel="http://schemas.microsoft.com/office/2019/extlst" xmlns:r="http://schemas.openxmlformats.org/officeDocument/2006/relationships" xmlns:m="http://schemas.openxmlformats.org/officeDocument/2006/math" xmlns:v="urn:schemas-microsoft-com:vml" xmlns:wp14="http://schemas.microsoft.com/office/word/2010/wordprocessingDrawing" xmlns:wp="http://schemas.openxmlformats.org/drawingml/2006/wordprocessingDrawing" xmlns:w10="urn:schemas-microsoft-com:office:word" xmlns:w="http://schemas.openxmlformats.org/wordprocessingml/2006/main" xmlns:w14="http://schemas.microsoft.com/office/word/2010/wordml" xmlns:w15="http://schemas.microsoft.com/office/word/2012/wordml" xmlns:w16cex="http://schemas.microsoft.com/office/word/2018/wordml/cex" xmlns:w16cid="http://schemas.microsoft.com/office/word/2016/wordml/cid" xmlns:w16="http://schemas.microsoft.com/office/word/2018/wordml" xmlns:w16du="http://schemas.microsoft.com/office/word/2023/wordml/word16du" xmlns:w16sdtdh="http://schemas.microsoft.com/office/word/2020/wordml/sdtdatahash" xmlns:w16se="http://schemas.microsoft.com/office/word/2015/wordml/symex" xmlns:wpg="http://schemas.microsoft.com/office/word/2010/wordprocessingGroup" xmlns:wpi="http://schemas.microsoft.com/office/word/2010/wordprocessingInk" xmlns:wne="http://schemas.microsoft.com/office/word/2006/wordml" xmlns:wps="http://schemas.microsoft.com/office/word/2010/wordprocessingShape" mc:Ignorable="w14 w15 w16se w16cid w16 w16cex w16sdtdh w16du wp14">
+<w:document xmlns:wpc="http://schemas.microsoft.com/office/word/2010/wordprocessingCanvas" xmlns:cx="http://schemas.microsoft.com/office/drawing/2014/chartex" xmlns:cx1="http://schemas.microsoft.com/office/drawing/2015/9/8/chartex" xmlns:cx2="http://schemas.microsoft.com/office/drawing/2015/10/21/chartex" xmlns:cx3="http://schemas.microsoft.com/office/drawing/2016/5/9/chartex" xmlns:cx4="http://schemas.microsoft.com/office/drawing/2016/5/10/chartex" xmlns:cx5="http://schemas.microsoft.com/office/drawing/2016/5/11/chartex" xmlns:cx6="http://schemas.microsoft.com/office/drawing/2016/5/12/chartex" xmlns:cx7="http://schemas.microsoft.com/office/drawing/2016/5/13/chartex" xmlns:cx8="http://schemas.microsoft.com/office/drawing/2016/5/14/chartex" xmlns:mc="http://schemas.openxmlformats.org/markup-compatibility/2006" xmlns:aink="http://schemas.microsoft.com/office/drawing/2016/ink" xmlns:am3d="http://schemas.microsoft.com/office/drawing/2017/model3d" xmlns:o="urn:schemas-microsoft-com:office:office" xmlns:oel="http://schemas.microsoft.com/office/2019/extlst" xmlns:r="http://schemas.openxmlformats.org/officeDocument/2006/relationships" xmlns:m="http://schemas.openxmlformats.org/officeDocument/2006/math" xmlns:v="urn:schemas-microsoft-com:vml" xmlns:wp14="http://schemas.microsoft.com/office/word/2010/wordprocessingDrawing" xmlns:wp="http://schemas.openxmlformats.org/drawingml/2006/wordprocessingDrawing" xmlns:w10="urn:schemas-microsoft-com:office:word" xmlns:w="http://schemas.openxmlformats.org/wordprocessingml/2006/main" xmlns:w14="http://schemas.microsoft.com/office/word/2010/wordml" xmlns:w15="http://schemas.microsoft.com/office/word/2012/wordml" xmlns:w16cex="http://schemas.microsoft.com/office/word/2018/wordml/cex" xmlns:w16cid="http://schemas.microsoft.com/office/word/2016/wordml/cid" xmlns:w16="http://schemas.microsoft.com/office/word/2018/wordml" xmlns:w16du="http://schemas.microsoft.com/office/word/2023/wordml/word16du" xmlns:w16sdtdh="http://schemas.microsoft.com/office/word/2020/wordml/sdtdatahash" xmlns:w16sdtfl="http://schemas.microsoft.com/office/word/2024/wordml/sdtformatlock" xmlns:w16se="http://schemas.microsoft.com/office/word/2015/wordml/symex" xmlns:wpg="http://schemas.microsoft.com/office/word/2010/wordprocessingGroup" xmlns:wpi="http://schemas.microsoft.com/office/word/2010/wordprocessingInk" xmlns:wne="http://schemas.microsoft.com/office/word/2006/wordml" xmlns:wps="http://schemas.microsoft.com/office/word/2010/wordprocessingShape" mc:Ignorable="w14 w15 w16se w16cid w16 w16cex w16sdtdh w16sdtfl w16du wp14">
   <w:body>
     <w:p>
       <w:pPr>
         <w:pStyle w:val="Sinespaciado"/>
-        <w:spacing w:line="276" w:lineRule="auto"/>
+        <w:spacing w:line="360" w:lineRule="auto"/>
         <w:jc w:val="center"/>
       </w:pPr>
       <w:r>
         <w:rPr>
-          <w:rFonts w:ascii="Calibri" w:eastAsia="Calibri" w:hAnsi="Calibri" w:cs="Calibri"/>
+          <w:rFonts w:eastAsia="Calibri"/>
           <w:noProof/>
           <w:sz w:val="22"/>
         </w:rPr>
@@ -706,7 +706,7 @@
     <w:p>
       <w:pPr>
         <w:pStyle w:val="Sinespaciado"/>
-        <w:spacing w:line="276" w:lineRule="auto"/>
+        <w:spacing w:line="360" w:lineRule="auto"/>
         <w:jc w:val="center"/>
       </w:pPr>
       <w:r>
@@ -719,20 +719,20 @@
     </w:p>
     <w:p>
       <w:pPr>
-        <w:spacing w:after="393" w:line="259" w:lineRule="auto"/>
+        <w:spacing w:after="393" w:line="360" w:lineRule="auto"/>
         <w:ind w:left="0" w:right="593" w:firstLine="0"/>
         <w:jc w:val="center"/>
       </w:pPr>
       <w:r>
         <w:rPr>
-          <w:rFonts w:ascii="Century Gothic" w:eastAsia="Century Gothic" w:hAnsi="Century Gothic" w:cs="Century Gothic"/>
+          <w:rFonts w:eastAsia="Century Gothic"/>
           <w:sz w:val="20"/>
         </w:rPr>
         <w:t xml:space="preserve"> </w:t>
       </w:r>
       <w:r>
         <w:rPr>
-          <w:rFonts w:ascii="Century Gothic" w:eastAsia="Century Gothic" w:hAnsi="Century Gothic" w:cs="Century Gothic"/>
+          <w:rFonts w:eastAsia="Century Gothic"/>
           <w:sz w:val="22"/>
         </w:rPr>
         <w:t xml:space="preserve"> </w:t>
@@ -743,7 +743,7 @@
     </w:p>
     <w:p>
       <w:pPr>
-        <w:spacing w:after="99" w:line="259" w:lineRule="auto"/>
+        <w:spacing w:after="99" w:line="360" w:lineRule="auto"/>
         <w:ind w:left="10" w:right="570"/>
         <w:jc w:val="center"/>
       </w:pPr>
@@ -757,7 +757,7 @@
     </w:p>
     <w:p>
       <w:pPr>
-        <w:spacing w:after="201" w:line="259" w:lineRule="auto"/>
+        <w:spacing w:after="201" w:line="360" w:lineRule="auto"/>
         <w:ind w:left="10" w:right="944"/>
         <w:jc w:val="center"/>
       </w:pPr>
@@ -770,14 +770,7 @@
     </w:p>
     <w:p>
       <w:pPr>
-        <w:spacing w:after="462" w:line="259" w:lineRule="auto"/>
-        <w:ind w:left="3157" w:firstLine="0"/>
-        <w:jc w:val="center"/>
-      </w:pPr>
-    </w:p>
-    <w:p>
-      <w:pPr>
-        <w:spacing w:after="99" w:line="259" w:lineRule="auto"/>
+        <w:spacing w:after="99" w:line="360" w:lineRule="auto"/>
         <w:ind w:left="10" w:right="572"/>
         <w:jc w:val="center"/>
       </w:pPr>
@@ -791,7 +784,7 @@
     </w:p>
     <w:p>
       <w:pPr>
-        <w:spacing w:after="105" w:line="265" w:lineRule="auto"/>
+        <w:spacing w:after="105" w:line="360" w:lineRule="auto"/>
         <w:ind w:right="198"/>
       </w:pPr>
       <w:r>
@@ -803,21 +796,7 @@
     </w:p>
     <w:p>
       <w:pPr>
-        <w:spacing w:after="0" w:line="259" w:lineRule="auto"/>
-        <w:ind w:left="0" w:right="360" w:firstLine="0"/>
-        <w:jc w:val="center"/>
-      </w:pPr>
-    </w:p>
-    <w:p>
-      <w:pPr>
-        <w:spacing w:after="257" w:line="259" w:lineRule="auto"/>
-        <w:ind w:left="0" w:right="470" w:firstLine="0"/>
-        <w:jc w:val="center"/>
-      </w:pPr>
-    </w:p>
-    <w:p>
-      <w:pPr>
-        <w:spacing w:after="99" w:line="259" w:lineRule="auto"/>
+        <w:spacing w:after="99" w:line="360" w:lineRule="auto"/>
         <w:ind w:left="10" w:right="568"/>
         <w:jc w:val="center"/>
       </w:pPr>
@@ -831,7 +810,7 @@
     </w:p>
     <w:p>
       <w:pPr>
-        <w:spacing w:after="193"/>
+        <w:spacing w:after="193" w:line="360" w:lineRule="auto"/>
         <w:ind w:left="77" w:right="960"/>
         <w:jc w:val="center"/>
       </w:pPr>
@@ -853,18 +832,7 @@
     </w:p>
     <w:p>
       <w:pPr>
-        <w:spacing w:after="464" w:line="259" w:lineRule="auto"/>
-        <w:ind w:left="2753" w:firstLine="0"/>
-        <w:jc w:val="center"/>
-        <w:rPr>
-          <w:sz w:val="32"/>
-          <w:szCs w:val="32"/>
-        </w:rPr>
-      </w:pPr>
-    </w:p>
-    <w:p>
-      <w:pPr>
-        <w:spacing w:after="99" w:line="259" w:lineRule="auto"/>
+        <w:spacing w:after="99" w:line="360" w:lineRule="auto"/>
         <w:ind w:left="10" w:right="570"/>
         <w:jc w:val="center"/>
       </w:pPr>
@@ -892,7 +860,7 @@
     </w:p>
     <w:p>
       <w:pPr>
-        <w:spacing w:after="99" w:line="259" w:lineRule="auto"/>
+        <w:spacing w:after="99" w:line="360" w:lineRule="auto"/>
         <w:ind w:left="10" w:right="570"/>
       </w:pPr>
       <w:r>
@@ -904,7 +872,7 @@
     </w:p>
     <w:p>
       <w:pPr>
-        <w:spacing w:after="99" w:line="259" w:lineRule="auto"/>
+        <w:spacing w:after="99" w:line="360" w:lineRule="auto"/>
         <w:ind w:left="10" w:right="570"/>
         <w:jc w:val="center"/>
       </w:pPr>
@@ -920,20 +888,8 @@
     </w:p>
     <w:p>
       <w:pPr>
-        <w:spacing w:after="99" w:line="259" w:lineRule="auto"/>
-        <w:ind w:left="10" w:right="570"/>
-        <w:jc w:val="center"/>
-        <w:rPr>
-          <w:sz w:val="28"/>
-          <w:szCs w:val="28"/>
-        </w:rPr>
-      </w:pPr>
-    </w:p>
-    <w:p>
-      <w:pPr>
-        <w:spacing w:after="99" w:line="259" w:lineRule="auto"/>
-        <w:ind w:left="10" w:right="570"/>
-        <w:jc w:val="center"/>
+        <w:spacing w:after="99" w:line="360" w:lineRule="auto"/>
+        <w:ind w:left="0" w:right="570" w:firstLine="0"/>
         <w:rPr>
           <w:sz w:val="30"/>
           <w:szCs w:val="30"/>
@@ -942,7 +898,7 @@
     </w:p>
     <w:p>
       <w:pPr>
-        <w:spacing w:after="99" w:line="259" w:lineRule="auto"/>
+        <w:spacing w:after="99" w:line="360" w:lineRule="auto"/>
         <w:ind w:left="10" w:right="1031"/>
         <w:jc w:val="center"/>
       </w:pPr>
@@ -956,9 +912,12 @@
     </w:p>
     <w:p>
       <w:pPr>
-        <w:spacing w:after="201" w:line="259" w:lineRule="auto"/>
+        <w:spacing w:after="201" w:line="360" w:lineRule="auto"/>
         <w:ind w:left="10" w:right="571"/>
         <w:jc w:val="center"/>
+        <w:rPr>
+          <w:sz w:val="28"/>
+        </w:rPr>
       </w:pPr>
       <w:r>
         <w:rPr>
@@ -969,295 +928,381 @@
     </w:p>
     <w:p>
       <w:pPr>
-        <w:spacing w:after="27" w:line="259" w:lineRule="auto"/>
+        <w:spacing w:after="201" w:line="360" w:lineRule="auto"/>
+        <w:ind w:left="10" w:right="571"/>
+        <w:jc w:val="center"/>
+        <w:rPr>
+          <w:sz w:val="28"/>
+        </w:rPr>
+      </w:pPr>
+    </w:p>
+    <w:p>
+      <w:pPr>
+        <w:spacing w:after="201" w:line="360" w:lineRule="auto"/>
+        <w:ind w:left="10" w:right="571"/>
+        <w:jc w:val="center"/>
+      </w:pPr>
+    </w:p>
+    <w:p>
+      <w:pPr>
+        <w:spacing w:after="27" w:line="360" w:lineRule="auto"/>
         <w:ind w:left="10" w:right="2"/>
         <w:jc w:val="left"/>
       </w:pPr>
     </w:p>
     <w:p>
       <w:pPr>
-        <w:spacing w:after="27" w:line="259" w:lineRule="auto"/>
+        <w:spacing w:after="27" w:line="360" w:lineRule="auto"/>
         <w:ind w:left="10" w:right="2"/>
         <w:jc w:val="left"/>
       </w:pPr>
-    </w:p>
-    <w:p>
-      <w:pPr>
-        <w:spacing w:after="27" w:line="259" w:lineRule="auto"/>
+      <w:r>
+        <w:t>Índice:</w:t>
+      </w:r>
+    </w:p>
+    <w:p>
+      <w:pPr>
+        <w:spacing w:after="27" w:line="360" w:lineRule="auto"/>
+        <w:ind w:right="2"/>
+        <w:jc w:val="left"/>
+      </w:pPr>
+      <w:r>
+        <w:t>Introducción.</w:t>
+      </w:r>
+    </w:p>
+    <w:p>
+      <w:pPr>
+        <w:pStyle w:val="Prrafodelista"/>
+        <w:numPr>
+          <w:ilvl w:val="0"/>
+          <w:numId w:val="20"/>
+        </w:numPr>
+        <w:spacing w:after="27" w:line="360" w:lineRule="auto"/>
+        <w:ind w:right="2"/>
+        <w:jc w:val="left"/>
+      </w:pPr>
+      <w:r>
+        <w:t>Definición del proyecto.</w:t>
+      </w:r>
+    </w:p>
+    <w:p>
+      <w:pPr>
+        <w:pStyle w:val="Prrafodelista"/>
+        <w:numPr>
+          <w:ilvl w:val="0"/>
+          <w:numId w:val="20"/>
+        </w:numPr>
+        <w:spacing w:after="27" w:line="360" w:lineRule="auto"/>
+        <w:ind w:right="2"/>
+      </w:pPr>
+      <w:r>
+        <w:t>Identificación de actividades</w:t>
+      </w:r>
+    </w:p>
+    <w:p>
+      <w:pPr>
+        <w:pStyle w:val="Prrafodelista"/>
+        <w:numPr>
+          <w:ilvl w:val="1"/>
+          <w:numId w:val="21"/>
+        </w:numPr>
+        <w:spacing w:after="27" w:line="360" w:lineRule="auto"/>
+        <w:ind w:right="2"/>
+      </w:pPr>
+      <w:r>
+        <w:t>Investigación y levantamiento de requerimientos.</w:t>
+      </w:r>
+    </w:p>
+    <w:p>
+      <w:pPr>
+        <w:pStyle w:val="Prrafodelista"/>
+        <w:numPr>
+          <w:ilvl w:val="1"/>
+          <w:numId w:val="21"/>
+        </w:numPr>
+        <w:spacing w:after="27" w:line="360" w:lineRule="auto"/>
+        <w:ind w:right="2"/>
+      </w:pPr>
+      <w:r>
+        <w:t>Análisis del sistema.</w:t>
+      </w:r>
+    </w:p>
+    <w:p>
+      <w:pPr>
+        <w:pStyle w:val="Prrafodelista"/>
+        <w:numPr>
+          <w:ilvl w:val="1"/>
+          <w:numId w:val="21"/>
+        </w:numPr>
+        <w:spacing w:after="27" w:line="360" w:lineRule="auto"/>
+        <w:ind w:right="2"/>
+      </w:pPr>
+      <w:r>
+        <w:t>Diseño del sistema.</w:t>
+      </w:r>
+    </w:p>
+    <w:p>
+      <w:pPr>
+        <w:pStyle w:val="Prrafodelista"/>
+        <w:numPr>
+          <w:ilvl w:val="1"/>
+          <w:numId w:val="21"/>
+        </w:numPr>
+        <w:spacing w:after="27" w:line="360" w:lineRule="auto"/>
+        <w:ind w:right="2"/>
+      </w:pPr>
+      <w:r>
+        <w:t>Diseño de la base de datos.</w:t>
+      </w:r>
+    </w:p>
+    <w:p>
+      <w:pPr>
+        <w:pStyle w:val="Prrafodelista"/>
+        <w:numPr>
+          <w:ilvl w:val="1"/>
+          <w:numId w:val="21"/>
+        </w:numPr>
+        <w:spacing w:after="27" w:line="360" w:lineRule="auto"/>
+        <w:ind w:right="2"/>
+      </w:pPr>
+      <w:r>
+        <w:t>Programación del sistema.</w:t>
+      </w:r>
+    </w:p>
+    <w:p>
+      <w:pPr>
+        <w:pStyle w:val="Prrafodelista"/>
+        <w:numPr>
+          <w:ilvl w:val="1"/>
+          <w:numId w:val="21"/>
+        </w:numPr>
+        <w:spacing w:after="27" w:line="360" w:lineRule="auto"/>
+        <w:ind w:right="2"/>
+      </w:pPr>
+      <w:r>
+        <w:t>Pruebas del sistema.</w:t>
+      </w:r>
+    </w:p>
+    <w:p>
+      <w:pPr>
+        <w:pStyle w:val="Prrafodelista"/>
+        <w:numPr>
+          <w:ilvl w:val="1"/>
+          <w:numId w:val="21"/>
+        </w:numPr>
+        <w:spacing w:after="27" w:line="360" w:lineRule="auto"/>
+        <w:ind w:right="2"/>
+      </w:pPr>
+      <w:r>
+        <w:t>Corrección de errores y ajustes.</w:t>
+      </w:r>
+    </w:p>
+    <w:p>
+      <w:pPr>
+        <w:pStyle w:val="Prrafodelista"/>
+        <w:numPr>
+          <w:ilvl w:val="1"/>
+          <w:numId w:val="21"/>
+        </w:numPr>
+        <w:spacing w:after="27" w:line="360" w:lineRule="auto"/>
+        <w:ind w:right="2"/>
+      </w:pPr>
+      <w:r>
+        <w:t>Implementación del sistema.</w:t>
+      </w:r>
+    </w:p>
+    <w:p>
+      <w:pPr>
+        <w:pStyle w:val="Prrafodelista"/>
+        <w:numPr>
+          <w:ilvl w:val="1"/>
+          <w:numId w:val="21"/>
+        </w:numPr>
+        <w:spacing w:after="27" w:line="360" w:lineRule="auto"/>
+        <w:ind w:right="2"/>
+      </w:pPr>
+      <w:r>
+        <w:t>Capacitación del personal.</w:t>
+      </w:r>
+    </w:p>
+    <w:p>
+      <w:pPr>
+        <w:pStyle w:val="Prrafodelista"/>
+        <w:numPr>
+          <w:ilvl w:val="1"/>
+          <w:numId w:val="21"/>
+        </w:numPr>
+        <w:spacing w:after="27" w:line="360" w:lineRule="auto"/>
+        <w:ind w:right="2"/>
+      </w:pPr>
+      <w:r>
+        <w:t>Entrega final del proyecto.</w:t>
+      </w:r>
+    </w:p>
+    <w:p>
+      <w:pPr>
+        <w:pStyle w:val="Prrafodelista"/>
+        <w:numPr>
+          <w:ilvl w:val="0"/>
+          <w:numId w:val="20"/>
+        </w:numPr>
+        <w:spacing w:after="27" w:line="360" w:lineRule="auto"/>
+        <w:ind w:right="2"/>
+        <w:jc w:val="left"/>
+      </w:pPr>
+      <w:r>
+        <w:t>Secuencias de actividades.</w:t>
+      </w:r>
+    </w:p>
+    <w:p>
+      <w:pPr>
+        <w:pStyle w:val="Prrafodelista"/>
+        <w:numPr>
+          <w:ilvl w:val="0"/>
+          <w:numId w:val="20"/>
+        </w:numPr>
+        <w:spacing w:after="27" w:line="360" w:lineRule="auto"/>
+        <w:ind w:right="2"/>
+        <w:jc w:val="left"/>
+      </w:pPr>
+      <w:r>
+        <w:t>Estimación de tiempo.</w:t>
+      </w:r>
+    </w:p>
+    <w:p>
+      <w:pPr>
+        <w:pStyle w:val="Prrafodelista"/>
+        <w:numPr>
+          <w:ilvl w:val="0"/>
+          <w:numId w:val="20"/>
+        </w:numPr>
+        <w:spacing w:after="27" w:line="360" w:lineRule="auto"/>
+        <w:ind w:right="2"/>
+        <w:jc w:val="left"/>
+      </w:pPr>
+      <w:r>
+        <w:t>Recursos.</w:t>
+      </w:r>
+    </w:p>
+    <w:p>
+      <w:pPr>
+        <w:pStyle w:val="Prrafodelista"/>
+        <w:numPr>
+          <w:ilvl w:val="0"/>
+          <w:numId w:val="20"/>
+        </w:numPr>
+        <w:spacing w:after="27" w:line="360" w:lineRule="auto"/>
+        <w:ind w:right="2"/>
+        <w:jc w:val="left"/>
+      </w:pPr>
+      <w:r>
+        <w:t>Cronogramas.</w:t>
+      </w:r>
+    </w:p>
+    <w:p>
+      <w:pPr>
+        <w:pStyle w:val="Prrafodelista"/>
+        <w:numPr>
+          <w:ilvl w:val="0"/>
+          <w:numId w:val="20"/>
+        </w:numPr>
+        <w:spacing w:after="27" w:line="360" w:lineRule="auto"/>
+        <w:ind w:right="2"/>
+        <w:jc w:val="left"/>
+      </w:pPr>
+      <w:r>
+        <w:t>Plan de control.</w:t>
+      </w:r>
+    </w:p>
+    <w:p>
+      <w:pPr>
+        <w:pStyle w:val="Prrafodelista"/>
+        <w:numPr>
+          <w:ilvl w:val="0"/>
+          <w:numId w:val="20"/>
+        </w:numPr>
+        <w:spacing w:after="27" w:line="360" w:lineRule="auto"/>
+        <w:ind w:right="2"/>
+        <w:jc w:val="left"/>
+      </w:pPr>
+      <w:r>
+        <w:t>Conclucion.</w:t>
+      </w:r>
+    </w:p>
+    <w:p>
+      <w:pPr>
+        <w:spacing w:after="27" w:line="360" w:lineRule="auto"/>
         <w:ind w:left="10" w:right="2"/>
         <w:jc w:val="left"/>
       </w:pPr>
     </w:p>
     <w:p>
       <w:pPr>
-        <w:spacing w:after="27" w:line="259" w:lineRule="auto"/>
+        <w:spacing w:after="27" w:line="360" w:lineRule="auto"/>
         <w:ind w:left="10" w:right="2"/>
         <w:jc w:val="left"/>
       </w:pPr>
     </w:p>
     <w:p>
       <w:pPr>
-        <w:spacing w:after="27" w:line="259" w:lineRule="auto"/>
+        <w:spacing w:after="27" w:line="360" w:lineRule="auto"/>
         <w:ind w:left="10" w:right="2"/>
         <w:jc w:val="left"/>
       </w:pPr>
     </w:p>
     <w:p>
       <w:pPr>
-        <w:spacing w:after="27" w:line="259" w:lineRule="auto"/>
+        <w:spacing w:after="27" w:line="360" w:lineRule="auto"/>
         <w:ind w:left="10" w:right="2"/>
         <w:jc w:val="left"/>
       </w:pPr>
     </w:p>
     <w:p>
       <w:pPr>
-        <w:spacing w:after="27" w:line="259" w:lineRule="auto"/>
+        <w:spacing w:after="27" w:line="360" w:lineRule="auto"/>
         <w:ind w:left="10" w:right="2"/>
         <w:jc w:val="left"/>
       </w:pPr>
     </w:p>
     <w:p>
       <w:pPr>
-        <w:spacing w:after="27" w:line="259" w:lineRule="auto"/>
+        <w:spacing w:after="27" w:line="360" w:lineRule="auto"/>
         <w:ind w:left="10" w:right="2"/>
         <w:jc w:val="left"/>
       </w:pPr>
     </w:p>
     <w:p>
       <w:pPr>
-        <w:spacing w:after="27" w:line="259" w:lineRule="auto"/>
+        <w:spacing w:after="27" w:line="360" w:lineRule="auto"/>
         <w:ind w:left="10" w:right="2"/>
         <w:jc w:val="left"/>
       </w:pPr>
     </w:p>
     <w:p>
       <w:pPr>
-        <w:spacing w:after="27" w:line="259" w:lineRule="auto"/>
+        <w:spacing w:after="27" w:line="360" w:lineRule="auto"/>
         <w:ind w:left="10" w:right="2"/>
         <w:jc w:val="left"/>
       </w:pPr>
     </w:p>
     <w:p>
       <w:pPr>
-        <w:spacing w:after="27" w:line="259" w:lineRule="auto"/>
+        <w:spacing w:after="27" w:line="360" w:lineRule="auto"/>
         <w:ind w:left="10" w:right="2"/>
         <w:jc w:val="left"/>
       </w:pPr>
     </w:p>
     <w:p>
       <w:pPr>
-        <w:spacing w:after="27" w:line="259" w:lineRule="auto"/>
-        <w:ind w:left="10" w:right="2"/>
-        <w:jc w:val="left"/>
-      </w:pPr>
-    </w:p>
-    <w:p>
-      <w:pPr>
-        <w:spacing w:after="27" w:line="259" w:lineRule="auto"/>
-        <w:ind w:left="10" w:right="2"/>
-        <w:jc w:val="left"/>
-      </w:pPr>
-    </w:p>
-    <w:p>
-      <w:pPr>
-        <w:spacing w:after="27" w:line="259" w:lineRule="auto"/>
-        <w:ind w:left="10" w:right="2"/>
-        <w:jc w:val="left"/>
-      </w:pPr>
-    </w:p>
-    <w:p>
-      <w:pPr>
-        <w:spacing w:after="27" w:line="259" w:lineRule="auto"/>
-        <w:ind w:left="10" w:right="2"/>
-        <w:jc w:val="left"/>
-      </w:pPr>
-    </w:p>
-    <w:p>
-      <w:pPr>
-        <w:spacing w:after="27" w:line="259" w:lineRule="auto"/>
-        <w:ind w:left="10" w:right="2"/>
-        <w:jc w:val="left"/>
-      </w:pPr>
-    </w:p>
-    <w:p>
-      <w:pPr>
-        <w:spacing w:after="27" w:line="259" w:lineRule="auto"/>
-        <w:ind w:left="10" w:right="2"/>
-        <w:jc w:val="left"/>
-      </w:pPr>
-    </w:p>
-    <w:p>
-      <w:pPr>
-        <w:spacing w:after="27" w:line="259" w:lineRule="auto"/>
-        <w:ind w:left="10" w:right="2"/>
-        <w:jc w:val="left"/>
-      </w:pPr>
-    </w:p>
-    <w:p>
-      <w:pPr>
-        <w:spacing w:after="27" w:line="259" w:lineRule="auto"/>
-        <w:ind w:left="10" w:right="2"/>
-        <w:jc w:val="left"/>
-      </w:pPr>
-    </w:p>
-    <w:p>
-      <w:pPr>
-        <w:spacing w:after="27" w:line="259" w:lineRule="auto"/>
-        <w:ind w:left="10" w:right="2"/>
-        <w:jc w:val="left"/>
-      </w:pPr>
-    </w:p>
-    <w:p>
-      <w:pPr>
-        <w:spacing w:after="27" w:line="259" w:lineRule="auto"/>
-        <w:ind w:left="10" w:right="2"/>
-        <w:jc w:val="left"/>
-      </w:pPr>
-    </w:p>
-    <w:p>
-      <w:pPr>
-        <w:spacing w:after="27" w:line="259" w:lineRule="auto"/>
-        <w:ind w:left="10" w:right="2"/>
-        <w:jc w:val="left"/>
-      </w:pPr>
-    </w:p>
-    <w:p>
-      <w:pPr>
-        <w:spacing w:after="27" w:line="259" w:lineRule="auto"/>
-        <w:ind w:left="10" w:right="2"/>
-        <w:jc w:val="left"/>
-      </w:pPr>
-    </w:p>
-    <w:p>
-      <w:pPr>
-        <w:spacing w:after="27" w:line="259" w:lineRule="auto"/>
-        <w:ind w:left="10" w:right="2"/>
-        <w:jc w:val="left"/>
-      </w:pPr>
-    </w:p>
-    <w:p>
-      <w:pPr>
-        <w:spacing w:after="27" w:line="259" w:lineRule="auto"/>
-        <w:ind w:left="10" w:right="2"/>
-        <w:jc w:val="left"/>
-      </w:pPr>
-    </w:p>
-    <w:p>
-      <w:pPr>
-        <w:spacing w:after="27" w:line="259" w:lineRule="auto"/>
-        <w:ind w:left="10" w:right="2"/>
-        <w:jc w:val="left"/>
-      </w:pPr>
-    </w:p>
-    <w:p>
-      <w:pPr>
-        <w:spacing w:after="27" w:line="259" w:lineRule="auto"/>
-        <w:ind w:left="10" w:right="2"/>
-        <w:jc w:val="left"/>
-      </w:pPr>
-    </w:p>
-    <w:p>
-      <w:pPr>
-        <w:spacing w:after="27" w:line="259" w:lineRule="auto"/>
-        <w:ind w:left="10" w:right="2"/>
-        <w:jc w:val="left"/>
-      </w:pPr>
-    </w:p>
-    <w:p>
-      <w:pPr>
-        <w:spacing w:after="27" w:line="259" w:lineRule="auto"/>
-        <w:ind w:left="10" w:right="2"/>
-        <w:jc w:val="left"/>
-      </w:pPr>
-    </w:p>
-    <w:p>
-      <w:pPr>
-        <w:spacing w:after="27" w:line="259" w:lineRule="auto"/>
-        <w:ind w:left="10" w:right="2"/>
-        <w:jc w:val="left"/>
-      </w:pPr>
-    </w:p>
-    <w:p>
-      <w:pPr>
-        <w:spacing w:after="27" w:line="259" w:lineRule="auto"/>
-        <w:ind w:left="10" w:right="2"/>
-        <w:jc w:val="left"/>
-      </w:pPr>
-    </w:p>
-    <w:p>
-      <w:pPr>
-        <w:spacing w:after="27" w:line="259" w:lineRule="auto"/>
-        <w:ind w:left="10" w:right="2"/>
-        <w:jc w:val="left"/>
-      </w:pPr>
-    </w:p>
-    <w:p>
-      <w:pPr>
-        <w:spacing w:after="27" w:line="259" w:lineRule="auto"/>
-        <w:ind w:left="10" w:right="2"/>
-        <w:jc w:val="left"/>
-      </w:pPr>
-    </w:p>
-    <w:p>
-      <w:pPr>
-        <w:spacing w:after="27" w:line="259" w:lineRule="auto"/>
-        <w:ind w:left="10" w:right="2"/>
-        <w:jc w:val="left"/>
-      </w:pPr>
-    </w:p>
-    <w:p>
-      <w:pPr>
-        <w:spacing w:after="27" w:line="259" w:lineRule="auto"/>
+        <w:spacing w:after="27" w:line="360" w:lineRule="auto"/>
         <w:ind w:left="0" w:right="2" w:firstLine="0"/>
         <w:jc w:val="left"/>
       </w:pPr>
     </w:p>
     <w:p>
       <w:pPr>
-        <w:spacing w:after="27" w:line="259" w:lineRule="auto"/>
+        <w:spacing w:after="27" w:line="360" w:lineRule="auto"/>
         <w:ind w:left="0" w:right="2" w:firstLine="0"/>
-        <w:jc w:val="left"/>
-      </w:pPr>
-    </w:p>
-    <w:p>
-      <w:pPr>
-        <w:spacing w:after="27" w:line="259" w:lineRule="auto"/>
-        <w:ind w:left="10" w:right="2"/>
-        <w:jc w:val="left"/>
-      </w:pPr>
-    </w:p>
-    <w:p>
-      <w:pPr>
-        <w:spacing w:after="27" w:line="259" w:lineRule="auto"/>
-        <w:ind w:left="10" w:right="2"/>
-        <w:jc w:val="left"/>
-      </w:pPr>
-    </w:p>
-    <w:p>
-      <w:pPr>
-        <w:spacing w:after="27" w:line="259" w:lineRule="auto"/>
-        <w:ind w:left="10" w:right="2"/>
-        <w:jc w:val="left"/>
-      </w:pPr>
-    </w:p>
-    <w:p>
-      <w:pPr>
-        <w:spacing w:after="27" w:line="259" w:lineRule="auto"/>
-        <w:ind w:left="10" w:right="2"/>
-        <w:jc w:val="left"/>
-      </w:pPr>
-    </w:p>
-    <w:p>
-      <w:pPr>
-        <w:spacing w:after="27" w:line="259" w:lineRule="auto"/>
-        <w:ind w:left="10" w:right="2"/>
-        <w:jc w:val="left"/>
-      </w:pPr>
-    </w:p>
-    <w:p>
-      <w:pPr>
-        <w:spacing w:after="27" w:line="276" w:lineRule="auto"/>
-        <w:ind w:left="10" w:right="2"/>
         <w:jc w:val="left"/>
         <w:rPr>
           <w:b/>
@@ -1273,37 +1318,12 @@
           <w:sz w:val="28"/>
           <w:szCs w:val="28"/>
         </w:rPr>
-        <w:lastRenderedPageBreak/>
         <w:t>Introducción</w:t>
       </w:r>
     </w:p>
     <w:p>
       <w:pPr>
-        <w:spacing w:after="27" w:line="276" w:lineRule="auto"/>
-        <w:ind w:left="10" w:right="2"/>
-        <w:jc w:val="left"/>
-        <w:rPr>
-          <w:b/>
-          <w:bCs/>
-          <w:sz w:val="10"/>
-          <w:szCs w:val="10"/>
-        </w:rPr>
-      </w:pPr>
-    </w:p>
-    <w:p>
-      <w:pPr>
-        <w:spacing w:after="27" w:line="276" w:lineRule="auto"/>
-        <w:ind w:left="10" w:right="2"/>
-        <w:jc w:val="left"/>
-        <w:rPr>
-          <w:sz w:val="32"/>
-          <w:szCs w:val="32"/>
-        </w:rPr>
-      </w:pPr>
-    </w:p>
-    <w:p>
-      <w:pPr>
-        <w:spacing w:after="27" w:line="276" w:lineRule="auto"/>
+        <w:spacing w:after="27" w:line="360" w:lineRule="auto"/>
         <w:ind w:left="10" w:right="2"/>
       </w:pPr>
       <w:r>
@@ -1325,17 +1345,7 @@
     </w:p>
     <w:p>
       <w:pPr>
-        <w:spacing w:after="27" w:line="276" w:lineRule="auto"/>
-        <w:ind w:left="10" w:right="2"/>
-        <w:rPr>
-          <w:sz w:val="36"/>
-          <w:szCs w:val="36"/>
-        </w:rPr>
-      </w:pPr>
-    </w:p>
-    <w:p>
-      <w:pPr>
-        <w:spacing w:after="27" w:line="276" w:lineRule="auto"/>
+        <w:spacing w:after="27" w:line="360" w:lineRule="auto"/>
         <w:ind w:left="10" w:right="2"/>
       </w:pPr>
       <w:r>
@@ -1374,17 +1384,7 @@
     </w:p>
     <w:p>
       <w:pPr>
-        <w:spacing w:after="27" w:line="276" w:lineRule="auto"/>
-        <w:ind w:left="10" w:right="2"/>
-        <w:rPr>
-          <w:sz w:val="36"/>
-          <w:szCs w:val="36"/>
-        </w:rPr>
-      </w:pPr>
-    </w:p>
-    <w:p>
-      <w:pPr>
-        <w:spacing w:after="27" w:line="276" w:lineRule="auto"/>
+        <w:spacing w:after="27" w:line="360" w:lineRule="auto"/>
         <w:ind w:left="10" w:right="2"/>
       </w:pPr>
       <w:r>
@@ -1413,17 +1413,7 @@
     </w:p>
     <w:p>
       <w:pPr>
-        <w:spacing w:after="27" w:line="276" w:lineRule="auto"/>
-        <w:ind w:left="10" w:right="2"/>
-        <w:rPr>
-          <w:sz w:val="36"/>
-          <w:szCs w:val="36"/>
-        </w:rPr>
-      </w:pPr>
-    </w:p>
-    <w:p>
-      <w:pPr>
-        <w:spacing w:after="27" w:line="276" w:lineRule="auto"/>
+        <w:spacing w:after="27" w:line="360" w:lineRule="auto"/>
         <w:ind w:left="10" w:right="2"/>
       </w:pPr>
       <w:r>
@@ -1442,26 +1432,20 @@
     </w:p>
     <w:p>
       <w:pPr>
-        <w:spacing w:after="27" w:line="276" w:lineRule="auto"/>
+        <w:spacing w:after="27" w:line="360" w:lineRule="auto"/>
         <w:ind w:left="10" w:right="2"/>
-        <w:rPr>
-          <w:sz w:val="36"/>
-          <w:szCs w:val="36"/>
-        </w:rPr>
-      </w:pPr>
-    </w:p>
-    <w:p>
-      <w:pPr>
-        <w:spacing w:after="27" w:line="276" w:lineRule="auto"/>
-        <w:ind w:left="10" w:right="2"/>
-      </w:pPr>
-      <w:r>
-        <w:t>De esta manera, se busca aplicar los conceptos estudiados en la asignatura de análisis de sistemas y demostrar cómo una adecuada planificación permite organizar de forma eficiente el desarrollo de un sistema de información, contribuyendo a mejorar la gestión de las citas médicas y la calidad del servicio ofrecido a los pacientes.</w:t>
-      </w:r>
-    </w:p>
-    <w:p>
-      <w:pPr>
-        <w:spacing w:after="27" w:line="276" w:lineRule="auto"/>
+      </w:pPr>
+      <w:r>
+        <w:t xml:space="preserve">De esta manera, se busca aplicar los conceptos estudiados en la asignatura de análisis de sistemas y demostrar cómo una adecuada planificación permite organizar de forma eficiente </w:t>
+      </w:r>
+      <w:r>
+        <w:lastRenderedPageBreak/>
+        <w:t>el desarrollo de un sistema de información, contribuyendo a mejorar la gestión de las citas médicas y la calidad del servicio ofrecido a los pacientes.</w:t>
+      </w:r>
+    </w:p>
+    <w:p>
+      <w:pPr>
+        <w:spacing w:after="27" w:line="360" w:lineRule="auto"/>
         <w:ind w:left="10" w:right="2"/>
         <w:rPr>
           <w:b/>
@@ -1477,151 +1461,78 @@
           <w:sz w:val="28"/>
           <w:szCs w:val="28"/>
         </w:rPr>
-        <w:lastRenderedPageBreak/>
         <w:t>1. Definición del proyecto</w:t>
       </w:r>
     </w:p>
     <w:p>
       <w:pPr>
-        <w:spacing w:after="27" w:line="276" w:lineRule="auto"/>
+        <w:spacing w:after="27" w:line="360" w:lineRule="auto"/>
         <w:ind w:left="10" w:right="2"/>
-        <w:rPr>
-          <w:sz w:val="44"/>
-          <w:szCs w:val="44"/>
-        </w:rPr>
-      </w:pPr>
-    </w:p>
-    <w:p>
-      <w:pPr>
-        <w:spacing w:after="27" w:line="276" w:lineRule="auto"/>
+      </w:pPr>
+      <w:r>
+        <w:t>El presente proyecto tiene como objetivo el desarrollo de un Sistema de Gestión de Citas Médicas para un centro de salud. Este sistema permitirá organizar y administrar las citas médicas de manera más eficiente, facilitando el registro de pacientes, la programación de consultas y la disponibilidad de los médicos.</w:t>
+      </w:r>
+    </w:p>
+    <w:p>
+      <w:pPr>
+        <w:spacing w:after="27" w:line="360" w:lineRule="auto"/>
         <w:ind w:left="10" w:right="2"/>
       </w:pPr>
       <w:r>
-        <w:t>El presente proyecto tiene como objetivo el desarrollo de un Sistema de Gestión de Citas Médicas para un centro de salud. Este sistema permitirá organizar y administrar las citas médicas de manera más eficiente, facilitando el registro de pacientes, la programación de consultas y la disponibilidad de los médicos.</w:t>
-      </w:r>
-    </w:p>
-    <w:p>
-      <w:pPr>
-        <w:spacing w:after="27" w:line="276" w:lineRule="auto"/>
+        <w:t>En muchos centros de salud, la gestión de citas aún se realiza de forma manual utilizando agendas físicas o registros simples en computadoras. Este tipo de métodos puede generar problemas como la duplicación de citas, pérdida de información o dificultades para organizar los horarios de atención. Debido a esto, surge la necesidad de implementar un sistema informático que permita automatizar este proceso.</w:t>
+      </w:r>
+    </w:p>
+    <w:p>
+      <w:pPr>
+        <w:spacing w:after="27" w:line="360" w:lineRule="auto"/>
         <w:ind w:left="10" w:right="2"/>
-        <w:rPr>
-          <w:sz w:val="36"/>
-          <w:szCs w:val="36"/>
-        </w:rPr>
-      </w:pPr>
-    </w:p>
-    <w:p>
-      <w:pPr>
-        <w:spacing w:after="27" w:line="276" w:lineRule="auto"/>
+      </w:pPr>
+      <w:r>
+        <w:t>El sistema permitirá registrar la información de los pacientes, consultar la disponibilidad de los médicos y asignar citas de forma ordenada. Además, el personal administrativo podrá acceder fácilmente a la información y realizar modificaciones cuando sea necesario.</w:t>
+      </w:r>
+    </w:p>
+    <w:p>
+      <w:pPr>
+        <w:spacing w:after="27" w:line="360" w:lineRule="auto"/>
         <w:ind w:left="10" w:right="2"/>
       </w:pPr>
       <w:r>
-        <w:t>En muchos centros de salud, la gestión de citas aún se realiza de forma manual utilizando agendas físicas o registros simples en computadoras. Este tipo de métodos puede generar problemas como la duplicación de citas, pérdida de información o dificultades para organizar los horarios de atención. Debido a esto, surge la necesidad de implementar un sistema informático que permita automatizar este proceso.</w:t>
-      </w:r>
-    </w:p>
-    <w:p>
-      <w:pPr>
-        <w:spacing w:after="27" w:line="276" w:lineRule="auto"/>
+        <w:t>La implementación de este sistema también ayudará a mejorar la atención al paciente, ya que reducirá el tiempo de espera y permitirá una mejor organización de las consultas médicas. De igual manera, facilitará el trabajo del personal del centro de salud al contar con una herramienta que optimiza la gestión de la información.</w:t>
+      </w:r>
+    </w:p>
+    <w:p>
+      <w:pPr>
+        <w:spacing w:after="27" w:line="360" w:lineRule="auto"/>
         <w:ind w:left="10" w:right="2"/>
-        <w:rPr>
-          <w:sz w:val="36"/>
-          <w:szCs w:val="36"/>
-        </w:rPr>
-      </w:pPr>
-    </w:p>
-    <w:p>
-      <w:pPr>
-        <w:spacing w:after="27" w:line="276" w:lineRule="auto"/>
+      </w:pPr>
+      <w:r>
+        <w:t>Además, el desarrollo de este sistema representa un paso importante hacia la modernización de los procesos administrativos del centro de salud. La incorporación de herramientas tecnológicas en la gestión de citas médicas permite mejorar la organización interna, reducir errores en la programación de consultas y facilitar el acceso a la información cuando sea necesario. De esta manera, el sistema no solo contribuye a optimizar el trabajo del personal, sino que también ayuda a ofrecer una atención más eficiente y organizada a los pacientes.</w:t>
+      </w:r>
+    </w:p>
+    <w:p>
+      <w:pPr>
+        <w:spacing w:after="27" w:line="360" w:lineRule="auto"/>
         <w:ind w:left="10" w:right="2"/>
       </w:pPr>
       <w:r>
-        <w:t>El sistema permitirá registrar la información de los pacientes, consultar la disponibilidad de los médicos y asignar citas de forma ordenada. Además, el personal administrativo podrá acceder fácilmente a la información y realizar modificaciones cuando sea necesario.</w:t>
-      </w:r>
-    </w:p>
-    <w:p>
-      <w:pPr>
-        <w:spacing w:after="27" w:line="276" w:lineRule="auto"/>
+        <w:t>En conclusión, el Sistema de Gestión de Citas Médicas busca mejorar la eficiencia en la administración de citas, reducir errores en la programación y ofrecer un servicio más organizado tanto para el personal médico como para los pacientes.</w:t>
+      </w:r>
+    </w:p>
+    <w:p>
+      <w:pPr>
+        <w:spacing w:after="27" w:line="360" w:lineRule="auto"/>
         <w:ind w:left="10" w:right="2"/>
-        <w:rPr>
-          <w:sz w:val="36"/>
-          <w:szCs w:val="36"/>
-        </w:rPr>
-      </w:pPr>
-    </w:p>
-    <w:p>
-      <w:pPr>
-        <w:spacing w:after="27" w:line="276" w:lineRule="auto"/>
+      </w:pPr>
+    </w:p>
+    <w:p>
+      <w:pPr>
+        <w:spacing w:after="27" w:line="360" w:lineRule="auto"/>
         <w:ind w:left="10" w:right="2"/>
       </w:pPr>
-      <w:r>
-        <w:t>La implementación de este sistema también ayudará a mejorar la atención al paciente, ya que reducirá el tiempo de espera y permitirá una mejor organización de las consultas médicas. De igual manera, facilitará el trabajo del personal del centro de salud al contar con una herramienta que optimiza la gestión de la información.</w:t>
-      </w:r>
-    </w:p>
-    <w:p>
-      <w:pPr>
-        <w:spacing w:after="27" w:line="276" w:lineRule="auto"/>
-        <w:ind w:left="10" w:right="2"/>
-        <w:rPr>
-          <w:sz w:val="36"/>
-          <w:szCs w:val="36"/>
-        </w:rPr>
-      </w:pPr>
-    </w:p>
-    <w:p>
-      <w:pPr>
-        <w:spacing w:after="27" w:line="276" w:lineRule="auto"/>
-        <w:ind w:left="10" w:right="2"/>
-      </w:pPr>
-      <w:r>
-        <w:t>Además, el desarrollo de este sistema representa un paso importante hacia la modernización de los procesos administrativos del centro de salud. La incorporación de herramientas tecnológicas en la gestión de citas médicas permite mejorar la organización interna, reducir errores en la programación de consultas y facilitar el acceso a la información cuando sea necesario. De esta manera, el sistema no solo contribuye a optimizar el trabajo del personal, sino que también ayuda a ofrecer una atención más eficiente y organizada a los pacientes.</w:t>
-      </w:r>
-    </w:p>
-    <w:p>
-      <w:pPr>
-        <w:spacing w:after="27" w:line="276" w:lineRule="auto"/>
-        <w:ind w:left="0" w:right="2" w:firstLine="0"/>
-        <w:rPr>
-          <w:sz w:val="36"/>
-          <w:szCs w:val="36"/>
-        </w:rPr>
-      </w:pPr>
-    </w:p>
-    <w:p>
-      <w:pPr>
-        <w:spacing w:after="27" w:line="276" w:lineRule="auto"/>
-        <w:ind w:left="10" w:right="2"/>
-      </w:pPr>
-      <w:r>
-        <w:t>En conclusión, el Sistema de Gestión de Citas Médicas busca mejorar la eficiencia en la administración de citas, reducir errores en la programación y ofrecer un servicio más organizado tanto para el personal médico como para los pacientes.</w:t>
-      </w:r>
-    </w:p>
-    <w:p>
-      <w:pPr>
-        <w:spacing w:after="27" w:line="276" w:lineRule="auto"/>
-        <w:ind w:left="10" w:right="2"/>
-      </w:pPr>
-    </w:p>
-    <w:p>
-      <w:pPr>
-        <w:spacing w:after="27" w:line="276" w:lineRule="auto"/>
-        <w:ind w:left="10" w:right="2"/>
-      </w:pPr>
-    </w:p>
-    <w:p>
-      <w:pPr>
-        <w:spacing w:after="27" w:line="276" w:lineRule="auto"/>
-        <w:ind w:left="10" w:right="2"/>
-      </w:pPr>
-    </w:p>
-    <w:p>
-      <w:pPr>
-        <w:spacing w:after="27" w:line="276" w:lineRule="auto"/>
-        <w:ind w:left="10" w:right="2"/>
-      </w:pPr>
-    </w:p>
-    <w:p>
-      <w:pPr>
-        <w:spacing w:after="27" w:line="276" w:lineRule="auto"/>
+    </w:p>
+    <w:p>
+      <w:pPr>
+        <w:spacing w:after="27" w:line="360" w:lineRule="auto"/>
         <w:ind w:left="10" w:right="2"/>
         <w:rPr>
           <w:b/>
@@ -1643,70 +1554,30 @@
     </w:p>
     <w:p>
       <w:pPr>
-        <w:spacing w:after="27" w:line="276" w:lineRule="auto"/>
+        <w:spacing w:after="27" w:line="360" w:lineRule="auto"/>
         <w:ind w:left="10" w:right="2"/>
-        <w:rPr>
-          <w:sz w:val="32"/>
-          <w:szCs w:val="32"/>
-        </w:rPr>
-      </w:pPr>
-    </w:p>
-    <w:p>
-      <w:pPr>
-        <w:spacing w:after="27" w:line="276" w:lineRule="auto"/>
+      </w:pPr>
+      <w:r>
+        <w:t>Para desarrollar el Sistema de Gestión de Citas Médicas es necesario identificar y organizar una serie de actividades que permitan completar el proyecto de forma estructurada y eficiente. Estas actividades representan las diferentes etapas del desarrollo del sistema y permiten planificar adecuadamente el trabajo del equipo, así como establecer un orden lógico en la ejecución de las tareas.</w:t>
+      </w:r>
+    </w:p>
+    <w:p>
+      <w:pPr>
+        <w:spacing w:after="27" w:line="360" w:lineRule="auto"/>
         <w:ind w:left="10" w:right="2"/>
       </w:pPr>
       <w:r>
-        <w:t>Para desarrollar el Sistema de Gestión de Citas Médicas es necesario identificar y organizar una serie de actividades que permitan completar el proyecto de forma estructurada y eficiente. Estas actividades representan las diferentes etapas del desarrollo del sistema y permiten planificar adecuadamente el trabajo del equipo, así como establecer un orden lógico en la ejecución de las tareas.</w:t>
-      </w:r>
-    </w:p>
-    <w:p>
-      <w:pPr>
-        <w:spacing w:after="27" w:line="276" w:lineRule="auto"/>
+        <w:t>La identificación de actividades es importante dentro de la planificación del proyecto, ya que permite dividir el trabajo en tareas más pequeñas y manejables. De esta manera, es posible estimar el tiempo requerido para cada actividad, asignar los recursos necesarios y realizar un seguimiento adecuado del progreso del proyecto. Además, permite comprender con mayor claridad el proceso que se seguirá para desarrollar el sistema y garantizar que se cumplan los objetivos establecidos.</w:t>
+      </w:r>
+    </w:p>
+    <w:p>
+      <w:pPr>
+        <w:spacing w:after="27" w:line="360" w:lineRule="auto"/>
         <w:ind w:left="10" w:right="2"/>
-        <w:rPr>
-          <w:sz w:val="36"/>
-          <w:szCs w:val="36"/>
-        </w:rPr>
-      </w:pPr>
-    </w:p>
-    <w:p>
-      <w:pPr>
-        <w:spacing w:after="27" w:line="276" w:lineRule="auto"/>
-        <w:ind w:left="10" w:right="2"/>
-      </w:pPr>
-      <w:r>
-        <w:t>La identificación de actividades es importante dentro de la planificación del proyecto, ya que permite dividir el trabajo en tareas más pequeñas y manejables. De esta manera, es posible estimar el tiempo requerido para cada actividad, asignar los recursos necesarios y realizar un seguimiento adecuado del progreso del proyecto. Además, permite comprender con mayor claridad el proceso que se seguirá para desarrollar el sistema y garantizar que se cumplan los objetivos establecidos.</w:t>
-      </w:r>
-    </w:p>
-    <w:p>
-      <w:pPr>
-        <w:spacing w:after="27" w:line="276" w:lineRule="auto"/>
-        <w:ind w:left="10" w:right="2"/>
-        <w:rPr>
-          <w:sz w:val="36"/>
-          <w:szCs w:val="36"/>
-        </w:rPr>
-      </w:pPr>
-    </w:p>
-    <w:p>
-      <w:pPr>
-        <w:spacing w:after="27" w:line="276" w:lineRule="auto"/>
-        <w:ind w:left="10" w:right="2"/>
       </w:pPr>
       <w:r>
         <w:t>A continuación, se enumeran las principales actividades necesarias para el desarrollo del Sistema de Gestión de Citas Médicas:</w:t>
       </w:r>
-    </w:p>
-    <w:p>
-      <w:pPr>
-        <w:spacing w:after="27" w:line="276" w:lineRule="auto"/>
-        <w:ind w:left="10" w:right="2"/>
-        <w:rPr>
-          <w:sz w:val="32"/>
-          <w:szCs w:val="32"/>
-        </w:rPr>
-      </w:pPr>
     </w:p>
     <w:p>
       <w:pPr>
@@ -1715,7 +1586,7 @@
           <w:ilvl w:val="0"/>
           <w:numId w:val="8"/>
         </w:numPr>
-        <w:spacing w:after="27" w:line="276" w:lineRule="auto"/>
+        <w:spacing w:after="27" w:line="360" w:lineRule="auto"/>
         <w:ind w:right="2"/>
       </w:pPr>
       <w:r>
@@ -1731,22 +1602,12 @@
     </w:p>
     <w:p>
       <w:pPr>
-        <w:spacing w:after="27" w:line="276" w:lineRule="auto"/>
-        <w:ind w:left="10" w:right="2"/>
-        <w:rPr>
-          <w:sz w:val="32"/>
-          <w:szCs w:val="32"/>
-        </w:rPr>
-      </w:pPr>
-    </w:p>
-    <w:p>
-      <w:pPr>
         <w:pStyle w:val="Prrafodelista"/>
         <w:numPr>
           <w:ilvl w:val="0"/>
           <w:numId w:val="8"/>
         </w:numPr>
-        <w:spacing w:after="27" w:line="276" w:lineRule="auto"/>
+        <w:spacing w:after="27" w:line="360" w:lineRule="auto"/>
         <w:ind w:right="2"/>
       </w:pPr>
       <w:r>
@@ -1762,22 +1623,12 @@
     </w:p>
     <w:p>
       <w:pPr>
-        <w:spacing w:after="27" w:line="276" w:lineRule="auto"/>
-        <w:ind w:left="10" w:right="2"/>
-        <w:rPr>
-          <w:sz w:val="32"/>
-          <w:szCs w:val="32"/>
-        </w:rPr>
-      </w:pPr>
-    </w:p>
-    <w:p>
-      <w:pPr>
         <w:pStyle w:val="Prrafodelista"/>
         <w:numPr>
           <w:ilvl w:val="0"/>
           <w:numId w:val="8"/>
         </w:numPr>
-        <w:spacing w:after="27" w:line="276" w:lineRule="auto"/>
+        <w:spacing w:after="27" w:line="360" w:lineRule="auto"/>
         <w:ind w:right="2"/>
       </w:pPr>
       <w:r>
@@ -1793,18 +1644,12 @@
     </w:p>
     <w:p>
       <w:pPr>
-        <w:spacing w:after="27" w:line="276" w:lineRule="auto"/>
-        <w:ind w:left="10" w:right="2"/>
-      </w:pPr>
-    </w:p>
-    <w:p>
-      <w:pPr>
         <w:pStyle w:val="Prrafodelista"/>
         <w:numPr>
           <w:ilvl w:val="0"/>
           <w:numId w:val="8"/>
         </w:numPr>
-        <w:spacing w:after="27" w:line="276" w:lineRule="auto"/>
+        <w:spacing w:after="27" w:line="360" w:lineRule="auto"/>
         <w:ind w:right="2"/>
       </w:pPr>
       <w:r>
@@ -1821,22 +1666,12 @@
     </w:p>
     <w:p>
       <w:pPr>
-        <w:spacing w:after="27" w:line="276" w:lineRule="auto"/>
-        <w:ind w:left="10" w:right="2"/>
-        <w:rPr>
-          <w:sz w:val="32"/>
-          <w:szCs w:val="32"/>
-        </w:rPr>
-      </w:pPr>
-    </w:p>
-    <w:p>
-      <w:pPr>
         <w:pStyle w:val="Prrafodelista"/>
         <w:numPr>
           <w:ilvl w:val="0"/>
           <w:numId w:val="8"/>
         </w:numPr>
-        <w:spacing w:after="27" w:line="276" w:lineRule="auto"/>
+        <w:spacing w:after="27" w:line="360" w:lineRule="auto"/>
         <w:ind w:right="2"/>
       </w:pPr>
       <w:r>
@@ -1852,22 +1687,12 @@
     </w:p>
     <w:p>
       <w:pPr>
-        <w:spacing w:after="27" w:line="276" w:lineRule="auto"/>
-        <w:ind w:left="10" w:right="2"/>
-        <w:rPr>
-          <w:sz w:val="32"/>
-          <w:szCs w:val="32"/>
-        </w:rPr>
-      </w:pPr>
-    </w:p>
-    <w:p>
-      <w:pPr>
         <w:pStyle w:val="Prrafodelista"/>
         <w:numPr>
           <w:ilvl w:val="0"/>
           <w:numId w:val="8"/>
         </w:numPr>
-        <w:spacing w:after="27" w:line="276" w:lineRule="auto"/>
+        <w:spacing w:after="27" w:line="360" w:lineRule="auto"/>
         <w:ind w:right="2"/>
       </w:pPr>
       <w:r>
@@ -1883,22 +1708,12 @@
     </w:p>
     <w:p>
       <w:pPr>
-        <w:spacing w:after="27" w:line="276" w:lineRule="auto"/>
-        <w:ind w:left="10" w:right="2"/>
-        <w:rPr>
-          <w:sz w:val="32"/>
-          <w:szCs w:val="32"/>
-        </w:rPr>
-      </w:pPr>
-    </w:p>
-    <w:p>
-      <w:pPr>
         <w:pStyle w:val="Prrafodelista"/>
         <w:numPr>
           <w:ilvl w:val="0"/>
           <w:numId w:val="8"/>
         </w:numPr>
-        <w:spacing w:after="27" w:line="276" w:lineRule="auto"/>
+        <w:spacing w:after="27" w:line="360" w:lineRule="auto"/>
         <w:ind w:right="2"/>
       </w:pPr>
       <w:r>
@@ -1914,22 +1729,12 @@
     </w:p>
     <w:p>
       <w:pPr>
-        <w:spacing w:after="27" w:line="276" w:lineRule="auto"/>
-        <w:ind w:left="10" w:right="2"/>
-        <w:rPr>
-          <w:sz w:val="32"/>
-          <w:szCs w:val="32"/>
-        </w:rPr>
-      </w:pPr>
-    </w:p>
-    <w:p>
-      <w:pPr>
         <w:pStyle w:val="Prrafodelista"/>
         <w:numPr>
           <w:ilvl w:val="0"/>
           <w:numId w:val="8"/>
         </w:numPr>
-        <w:spacing w:after="27" w:line="276" w:lineRule="auto"/>
+        <w:spacing w:after="27" w:line="360" w:lineRule="auto"/>
         <w:ind w:right="2"/>
       </w:pPr>
       <w:r>
@@ -1945,22 +1750,12 @@
     </w:p>
     <w:p>
       <w:pPr>
-        <w:spacing w:after="27" w:line="276" w:lineRule="auto"/>
-        <w:ind w:left="10" w:right="2"/>
-        <w:rPr>
-          <w:sz w:val="32"/>
-          <w:szCs w:val="32"/>
-        </w:rPr>
-      </w:pPr>
-    </w:p>
-    <w:p>
-      <w:pPr>
         <w:pStyle w:val="Prrafodelista"/>
         <w:numPr>
           <w:ilvl w:val="0"/>
           <w:numId w:val="8"/>
         </w:numPr>
-        <w:spacing w:after="27" w:line="276" w:lineRule="auto"/>
+        <w:spacing w:after="27" w:line="360" w:lineRule="auto"/>
         <w:ind w:right="2"/>
       </w:pPr>
       <w:r>
@@ -1976,22 +1771,12 @@
     </w:p>
     <w:p>
       <w:pPr>
-        <w:spacing w:after="27" w:line="276" w:lineRule="auto"/>
-        <w:ind w:left="10" w:right="2"/>
-        <w:rPr>
-          <w:sz w:val="32"/>
-          <w:szCs w:val="32"/>
-        </w:rPr>
-      </w:pPr>
-    </w:p>
-    <w:p>
-      <w:pPr>
         <w:pStyle w:val="Prrafodelista"/>
         <w:numPr>
           <w:ilvl w:val="0"/>
           <w:numId w:val="8"/>
         </w:numPr>
-        <w:spacing w:after="27" w:line="276" w:lineRule="auto"/>
+        <w:spacing w:after="27" w:line="360" w:lineRule="auto"/>
         <w:ind w:right="2"/>
       </w:pPr>
       <w:r>
@@ -2010,26 +1795,30 @@
     </w:p>
     <w:p>
       <w:pPr>
-        <w:spacing w:after="27" w:line="276" w:lineRule="auto"/>
+        <w:spacing w:after="27" w:line="360" w:lineRule="auto"/>
+        <w:ind w:right="2"/>
+      </w:pPr>
+    </w:p>
+    <w:p>
+      <w:pPr>
+        <w:spacing w:after="27" w:line="360" w:lineRule="auto"/>
+        <w:ind w:right="2"/>
+      </w:pPr>
+    </w:p>
+    <w:p>
+      <w:pPr>
+        <w:spacing w:after="27" w:line="360" w:lineRule="auto"/>
         <w:ind w:left="10" w:right="2"/>
         <w:rPr>
           <w:b/>
           <w:bCs/>
         </w:rPr>
       </w:pPr>
-    </w:p>
-    <w:p>
-      <w:pPr>
-        <w:spacing w:after="27" w:line="276" w:lineRule="auto"/>
-        <w:ind w:left="10" w:right="2"/>
-      </w:pPr>
-    </w:p>
-    <w:p>
-      <w:pPr>
-        <w:spacing w:after="27" w:line="276" w:lineRule="auto"/>
-        <w:ind w:left="10" w:right="2"/>
-      </w:pPr>
-      <w:r>
+      <w:r>
+        <w:rPr>
+          <w:b/>
+          <w:bCs/>
+        </w:rPr>
         <w:lastRenderedPageBreak/>
         <w:t>Secuencias de las actividades detalladas.</w:t>
       </w:r>
@@ -2050,6 +1839,7 @@
           </w:tcPr>
           <w:p>
             <w:pPr>
+              <w:spacing w:line="360" w:lineRule="auto"/>
               <w:rPr>
                 <w:lang w:val="es-ES"/>
               </w:rPr>
@@ -2083,7 +1873,7 @@
                 <w:ilvl w:val="0"/>
                 <w:numId w:val="10"/>
               </w:numPr>
-              <w:spacing w:after="0" w:line="240" w:lineRule="auto"/>
+              <w:spacing w:after="0" w:line="360" w:lineRule="auto"/>
               <w:jc w:val="left"/>
               <w:rPr>
                 <w:lang w:val="es-ES"/>
@@ -2110,7 +1900,7 @@
                 <w:ilvl w:val="0"/>
                 <w:numId w:val="10"/>
               </w:numPr>
-              <w:spacing w:after="0" w:line="240" w:lineRule="auto"/>
+              <w:spacing w:after="0" w:line="360" w:lineRule="auto"/>
               <w:jc w:val="left"/>
               <w:rPr>
                 <w:lang w:val="es-ES"/>
@@ -2137,7 +1927,7 @@
                 <w:ilvl w:val="0"/>
                 <w:numId w:val="10"/>
               </w:numPr>
-              <w:spacing w:after="0" w:line="240" w:lineRule="auto"/>
+              <w:spacing w:after="0" w:line="360" w:lineRule="auto"/>
               <w:jc w:val="left"/>
               <w:rPr>
                 <w:lang w:val="es-ES"/>
@@ -2164,7 +1954,7 @@
                 <w:ilvl w:val="0"/>
                 <w:numId w:val="10"/>
               </w:numPr>
-              <w:spacing w:after="0" w:line="240" w:lineRule="auto"/>
+              <w:spacing w:after="0" w:line="360" w:lineRule="auto"/>
               <w:jc w:val="left"/>
               <w:rPr>
                 <w:lang w:val="es-ES"/>
@@ -2186,6 +1976,7 @@
           </w:tcPr>
           <w:p>
             <w:pPr>
+              <w:spacing w:line="360" w:lineRule="auto"/>
               <w:rPr>
                 <w:lang w:val="es-ES"/>
               </w:rPr>
@@ -2218,7 +2009,7 @@
                 <w:ilvl w:val="0"/>
                 <w:numId w:val="11"/>
               </w:numPr>
-              <w:spacing w:after="0" w:line="240" w:lineRule="auto"/>
+              <w:spacing w:after="0" w:line="360" w:lineRule="auto"/>
               <w:jc w:val="left"/>
               <w:rPr>
                 <w:lang w:val="es-ES"/>
@@ -2245,7 +2036,7 @@
                 <w:ilvl w:val="0"/>
                 <w:numId w:val="11"/>
               </w:numPr>
-              <w:spacing w:after="0" w:line="240" w:lineRule="auto"/>
+              <w:spacing w:after="0" w:line="360" w:lineRule="auto"/>
               <w:jc w:val="left"/>
               <w:rPr>
                 <w:lang w:val="es-ES"/>
@@ -2272,7 +2063,7 @@
                 <w:ilvl w:val="0"/>
                 <w:numId w:val="11"/>
               </w:numPr>
-              <w:spacing w:after="0" w:line="240" w:lineRule="auto"/>
+              <w:spacing w:after="0" w:line="360" w:lineRule="auto"/>
               <w:jc w:val="left"/>
               <w:rPr>
                 <w:lang w:val="es-ES"/>
@@ -2299,7 +2090,7 @@
                 <w:ilvl w:val="0"/>
                 <w:numId w:val="11"/>
               </w:numPr>
-              <w:spacing w:after="0" w:line="240" w:lineRule="auto"/>
+              <w:spacing w:after="0" w:line="360" w:lineRule="auto"/>
               <w:jc w:val="left"/>
               <w:rPr>
                 <w:lang w:val="es-ES"/>
@@ -2321,6 +2112,7 @@
           </w:tcPr>
           <w:p>
             <w:pPr>
+              <w:spacing w:line="360" w:lineRule="auto"/>
               <w:rPr>
                 <w:lang w:val="es-ES"/>
               </w:rPr>
@@ -2329,13 +2121,7 @@
               <w:rPr>
                 <w:lang w:val="es-ES"/>
               </w:rPr>
-              <w:t>3.</w:t>
-            </w:r>
-            <w:r>
-              <w:rPr>
-                <w:lang w:val="es-ES"/>
-              </w:rPr>
-              <w:t xml:space="preserve"> </w:t>
+              <w:t xml:space="preserve">3. </w:t>
             </w:r>
             <w:r>
               <w:rPr>
@@ -2359,7 +2145,7 @@
                 <w:ilvl w:val="0"/>
                 <w:numId w:val="12"/>
               </w:numPr>
-              <w:spacing w:after="0" w:line="240" w:lineRule="auto"/>
+              <w:spacing w:after="0" w:line="360" w:lineRule="auto"/>
               <w:jc w:val="left"/>
               <w:rPr>
                 <w:lang w:val="es-ES"/>
@@ -2386,7 +2172,7 @@
                 <w:ilvl w:val="0"/>
                 <w:numId w:val="12"/>
               </w:numPr>
-              <w:spacing w:after="0" w:line="240" w:lineRule="auto"/>
+              <w:spacing w:after="0" w:line="360" w:lineRule="auto"/>
               <w:jc w:val="left"/>
               <w:rPr>
                 <w:lang w:val="es-ES"/>
@@ -2413,7 +2199,7 @@
                 <w:ilvl w:val="0"/>
                 <w:numId w:val="12"/>
               </w:numPr>
-              <w:spacing w:after="0" w:line="240" w:lineRule="auto"/>
+              <w:spacing w:after="0" w:line="360" w:lineRule="auto"/>
               <w:jc w:val="left"/>
               <w:rPr>
                 <w:lang w:val="es-ES"/>
@@ -2435,6 +2221,7 @@
           </w:tcPr>
           <w:p>
             <w:pPr>
+              <w:spacing w:line="360" w:lineRule="auto"/>
               <w:rPr>
                 <w:lang w:val="es-ES"/>
               </w:rPr>
@@ -2478,7 +2265,7 @@
                 <w:ilvl w:val="0"/>
                 <w:numId w:val="13"/>
               </w:numPr>
-              <w:spacing w:after="0" w:line="240" w:lineRule="auto"/>
+              <w:spacing w:after="0" w:line="360" w:lineRule="auto"/>
               <w:jc w:val="left"/>
               <w:rPr>
                 <w:lang w:val="es-ES"/>
@@ -2505,7 +2292,7 @@
                 <w:ilvl w:val="0"/>
                 <w:numId w:val="13"/>
               </w:numPr>
-              <w:spacing w:after="0" w:line="240" w:lineRule="auto"/>
+              <w:spacing w:after="0" w:line="360" w:lineRule="auto"/>
               <w:jc w:val="left"/>
               <w:rPr>
                 <w:lang w:val="es-ES"/>
@@ -2527,6 +2314,7 @@
           </w:tcPr>
           <w:p>
             <w:pPr>
+              <w:spacing w:line="360" w:lineRule="auto"/>
               <w:rPr>
                 <w:lang w:val="es-ES"/>
               </w:rPr>
@@ -2568,7 +2356,7 @@
                 <w:ilvl w:val="0"/>
                 <w:numId w:val="14"/>
               </w:numPr>
-              <w:spacing w:after="0" w:line="240" w:lineRule="auto"/>
+              <w:spacing w:after="0" w:line="360" w:lineRule="auto"/>
               <w:jc w:val="left"/>
               <w:rPr>
                 <w:lang w:val="es-ES"/>
@@ -2595,7 +2383,7 @@
                 <w:ilvl w:val="0"/>
                 <w:numId w:val="14"/>
               </w:numPr>
-              <w:spacing w:after="0" w:line="240" w:lineRule="auto"/>
+              <w:spacing w:after="0" w:line="360" w:lineRule="auto"/>
               <w:jc w:val="left"/>
               <w:rPr>
                 <w:lang w:val="es-ES"/>
@@ -2622,7 +2410,7 @@
                 <w:ilvl w:val="0"/>
                 <w:numId w:val="14"/>
               </w:numPr>
-              <w:spacing w:after="0" w:line="240" w:lineRule="auto"/>
+              <w:spacing w:after="0" w:line="360" w:lineRule="auto"/>
               <w:jc w:val="left"/>
               <w:rPr>
                 <w:lang w:val="es-ES"/>
@@ -2649,7 +2437,7 @@
                 <w:ilvl w:val="0"/>
                 <w:numId w:val="14"/>
               </w:numPr>
-              <w:spacing w:after="0" w:line="240" w:lineRule="auto"/>
+              <w:spacing w:after="0" w:line="360" w:lineRule="auto"/>
               <w:jc w:val="left"/>
               <w:rPr>
                 <w:lang w:val="es-ES"/>
@@ -2671,6 +2459,7 @@
           </w:tcPr>
           <w:p>
             <w:pPr>
+              <w:spacing w:line="360" w:lineRule="auto"/>
               <w:rPr>
                 <w:lang w:val="es-ES"/>
               </w:rPr>
@@ -2712,7 +2501,7 @@
                 <w:ilvl w:val="0"/>
                 <w:numId w:val="15"/>
               </w:numPr>
-              <w:spacing w:after="0" w:line="240" w:lineRule="auto"/>
+              <w:spacing w:after="0" w:line="360" w:lineRule="auto"/>
               <w:jc w:val="left"/>
               <w:rPr>
                 <w:lang w:val="es-ES"/>
@@ -2739,7 +2528,7 @@
                 <w:ilvl w:val="0"/>
                 <w:numId w:val="15"/>
               </w:numPr>
-              <w:spacing w:after="0" w:line="240" w:lineRule="auto"/>
+              <w:spacing w:after="0" w:line="360" w:lineRule="auto"/>
               <w:jc w:val="left"/>
               <w:rPr>
                 <w:lang w:val="es-ES"/>
@@ -2761,6 +2550,7 @@
           </w:tcPr>
           <w:p>
             <w:pPr>
+              <w:spacing w:line="360" w:lineRule="auto"/>
               <w:rPr>
                 <w:lang w:val="es-ES"/>
               </w:rPr>
@@ -2804,7 +2594,7 @@
                 <w:ilvl w:val="0"/>
                 <w:numId w:val="16"/>
               </w:numPr>
-              <w:spacing w:after="0" w:line="240" w:lineRule="auto"/>
+              <w:spacing w:after="0" w:line="360" w:lineRule="auto"/>
               <w:jc w:val="left"/>
               <w:rPr>
                 <w:lang w:val="es-ES"/>
@@ -2831,7 +2621,7 @@
                 <w:ilvl w:val="0"/>
                 <w:numId w:val="16"/>
               </w:numPr>
-              <w:spacing w:after="0" w:line="240" w:lineRule="auto"/>
+              <w:spacing w:after="0" w:line="360" w:lineRule="auto"/>
               <w:jc w:val="left"/>
               <w:rPr>
                 <w:lang w:val="es-ES"/>
@@ -2853,6 +2643,7 @@
           </w:tcPr>
           <w:p>
             <w:pPr>
+              <w:spacing w:line="360" w:lineRule="auto"/>
               <w:rPr>
                 <w:lang w:val="es-ES"/>
               </w:rPr>
@@ -2894,7 +2685,7 @@
                 <w:ilvl w:val="0"/>
                 <w:numId w:val="17"/>
               </w:numPr>
-              <w:spacing w:after="0" w:line="240" w:lineRule="auto"/>
+              <w:spacing w:after="0" w:line="360" w:lineRule="auto"/>
               <w:jc w:val="left"/>
               <w:rPr>
                 <w:lang w:val="es-ES"/>
@@ -2904,6 +2695,7 @@
               <w:rPr>
                 <w:lang w:val="es-ES"/>
               </w:rPr>
+              <w:lastRenderedPageBreak/>
               <w:t>Implementar.</w:t>
             </w:r>
           </w:p>
@@ -2921,7 +2713,7 @@
                 <w:ilvl w:val="0"/>
                 <w:numId w:val="17"/>
               </w:numPr>
-              <w:spacing w:after="0" w:line="240" w:lineRule="auto"/>
+              <w:spacing w:after="0" w:line="360" w:lineRule="auto"/>
               <w:jc w:val="left"/>
               <w:rPr>
                 <w:lang w:val="es-ES"/>
@@ -2943,6 +2735,7 @@
           </w:tcPr>
           <w:p>
             <w:pPr>
+              <w:spacing w:line="360" w:lineRule="auto"/>
               <w:rPr>
                 <w:lang w:val="es-ES"/>
               </w:rPr>
@@ -2984,7 +2777,7 @@
                 <w:ilvl w:val="0"/>
                 <w:numId w:val="18"/>
               </w:numPr>
-              <w:spacing w:after="0" w:line="240" w:lineRule="auto"/>
+              <w:spacing w:after="0" w:line="360" w:lineRule="auto"/>
               <w:jc w:val="left"/>
               <w:rPr>
                 <w:lang w:val="es-ES"/>
@@ -3006,6 +2799,7 @@
           </w:tcPr>
           <w:p>
             <w:pPr>
+              <w:spacing w:line="360" w:lineRule="auto"/>
               <w:rPr>
                 <w:lang w:val="es-ES"/>
               </w:rPr>
@@ -3038,7 +2832,7 @@
                 <w:ilvl w:val="0"/>
                 <w:numId w:val="19"/>
               </w:numPr>
-              <w:spacing w:after="0" w:line="240" w:lineRule="auto"/>
+              <w:spacing w:after="0" w:line="360" w:lineRule="auto"/>
               <w:jc w:val="left"/>
               <w:rPr>
                 <w:lang w:val="es-ES"/>
@@ -3056,24 +2850,328 @@
     </w:tbl>
     <w:p>
       <w:pPr>
-        <w:spacing w:after="27" w:line="276" w:lineRule="auto"/>
+        <w:spacing w:after="27" w:line="360" w:lineRule="auto"/>
+        <w:ind w:left="0" w:right="2" w:firstLine="0"/>
+      </w:pPr>
+    </w:p>
+    <w:p>
+      <w:pPr>
+        <w:spacing w:after="27" w:line="360" w:lineRule="auto"/>
         <w:ind w:left="10" w:right="2"/>
-      </w:pPr>
-    </w:p>
-    <w:p>
-      <w:pPr>
-        <w:spacing w:after="27" w:line="276" w:lineRule="auto"/>
+        <w:rPr>
+          <w:b/>
+          <w:bCs/>
+          <w:sz w:val="28"/>
+          <w:szCs w:val="28"/>
+        </w:rPr>
+      </w:pPr>
+      <w:r>
+        <w:rPr>
+          <w:b/>
+          <w:bCs/>
+          <w:sz w:val="28"/>
+          <w:szCs w:val="28"/>
+        </w:rPr>
+        <w:t>7. Plan de control</w:t>
+      </w:r>
+    </w:p>
+    <w:p>
+      <w:pPr>
+        <w:spacing w:after="27" w:line="360" w:lineRule="auto"/>
         <w:ind w:left="10" w:right="2"/>
       </w:pPr>
-    </w:p>
-    <w:p>
-      <w:pPr>
-        <w:spacing w:after="27" w:line="276" w:lineRule="auto"/>
+      <w:r>
+        <w:t>1. Monitoreando los diagramas de Gantt cada semana.</w:t>
+      </w:r>
+    </w:p>
+    <w:p>
+      <w:pPr>
+        <w:spacing w:after="27" w:line="360" w:lineRule="auto"/>
         <w:ind w:left="10" w:right="2"/>
       </w:pPr>
       <w:r>
-        <w:t>Gt resssaaaaa</w:t>
-      </w:r>
+        <w:t>2. Asegurando que la secuencia de las actividades se realice con la mejor calidad.</w:t>
+      </w:r>
+    </w:p>
+    <w:p>
+      <w:pPr>
+        <w:spacing w:after="27" w:line="360" w:lineRule="auto"/>
+        <w:ind w:left="10" w:right="2"/>
+      </w:pPr>
+      <w:r>
+        <w:t>3. Feedback cada 2 semanas de las actividades en cursos.</w:t>
+      </w:r>
+    </w:p>
+    <w:p>
+      <w:pPr>
+        <w:spacing w:after="27" w:line="360" w:lineRule="auto"/>
+        <w:ind w:left="10" w:right="2"/>
+      </w:pPr>
+      <w:r>
+        <w:t>4. Cumplimiento de los objetivos SMART.</w:t>
+      </w:r>
+    </w:p>
+    <w:p>
+      <w:pPr>
+        <w:spacing w:after="27" w:line="360" w:lineRule="auto"/>
+        <w:ind w:left="10" w:right="2"/>
+      </w:pPr>
+      <w:r>
+        <w:t>5. El costo no exceda lo planificado.</w:t>
+      </w:r>
+    </w:p>
+    <w:p>
+      <w:pPr>
+        <w:spacing w:after="27" w:line="360" w:lineRule="auto"/>
+        <w:ind w:left="10" w:right="2"/>
+      </w:pPr>
+    </w:p>
+    <w:p>
+      <w:pPr>
+        <w:spacing w:after="27" w:line="360" w:lineRule="auto"/>
+        <w:ind w:left="10" w:right="2"/>
+      </w:pPr>
+    </w:p>
+    <w:p>
+      <w:pPr>
+        <w:spacing w:after="27" w:line="360" w:lineRule="auto"/>
+        <w:ind w:left="10" w:right="2"/>
+      </w:pPr>
+    </w:p>
+    <w:p>
+      <w:pPr>
+        <w:spacing w:after="27" w:line="360" w:lineRule="auto"/>
+        <w:ind w:left="10" w:right="2"/>
+      </w:pPr>
+    </w:p>
+    <w:p>
+      <w:pPr>
+        <w:spacing w:after="27" w:line="360" w:lineRule="auto"/>
+        <w:ind w:left="10" w:right="2"/>
+      </w:pPr>
+    </w:p>
+    <w:p>
+      <w:pPr>
+        <w:spacing w:after="27" w:line="360" w:lineRule="auto"/>
+        <w:ind w:left="10" w:right="2"/>
+      </w:pPr>
+    </w:p>
+    <w:p>
+      <w:pPr>
+        <w:spacing w:after="27" w:line="360" w:lineRule="auto"/>
+        <w:ind w:left="10" w:right="2"/>
+      </w:pPr>
+    </w:p>
+    <w:p>
+      <w:pPr>
+        <w:spacing w:after="27" w:line="360" w:lineRule="auto"/>
+        <w:ind w:left="10" w:right="2"/>
+      </w:pPr>
+    </w:p>
+    <w:p>
+      <w:pPr>
+        <w:spacing w:after="27" w:line="360" w:lineRule="auto"/>
+        <w:ind w:left="10" w:right="2"/>
+      </w:pPr>
+    </w:p>
+    <w:p>
+      <w:pPr>
+        <w:spacing w:after="27" w:line="360" w:lineRule="auto"/>
+        <w:ind w:left="10" w:right="2"/>
+      </w:pPr>
+    </w:p>
+    <w:p>
+      <w:pPr>
+        <w:spacing w:after="27" w:line="360" w:lineRule="auto"/>
+        <w:ind w:left="10" w:right="2"/>
+      </w:pPr>
+    </w:p>
+    <w:p>
+      <w:pPr>
+        <w:spacing w:after="27" w:line="360" w:lineRule="auto"/>
+        <w:ind w:left="10" w:right="2"/>
+      </w:pPr>
+    </w:p>
+    <w:p>
+      <w:pPr>
+        <w:spacing w:after="27" w:line="360" w:lineRule="auto"/>
+        <w:ind w:left="10" w:right="2"/>
+      </w:pPr>
+    </w:p>
+    <w:p>
+      <w:pPr>
+        <w:spacing w:after="27" w:line="360" w:lineRule="auto"/>
+        <w:ind w:left="10" w:right="2"/>
+      </w:pPr>
+    </w:p>
+    <w:p>
+      <w:pPr>
+        <w:spacing w:after="27" w:line="360" w:lineRule="auto"/>
+        <w:ind w:left="10" w:right="2"/>
+      </w:pPr>
+    </w:p>
+    <w:p>
+      <w:pPr>
+        <w:spacing w:after="27" w:line="360" w:lineRule="auto"/>
+        <w:ind w:left="10" w:right="2"/>
+      </w:pPr>
+    </w:p>
+    <w:p>
+      <w:pPr>
+        <w:spacing w:after="27" w:line="360" w:lineRule="auto"/>
+        <w:ind w:right="2"/>
+        <w:rPr>
+          <w:b/>
+          <w:bCs/>
+          <w:sz w:val="28"/>
+          <w:szCs w:val="28"/>
+        </w:rPr>
+      </w:pPr>
+      <w:r>
+        <w:rPr>
+          <w:b/>
+          <w:bCs/>
+          <w:sz w:val="28"/>
+          <w:szCs w:val="28"/>
+        </w:rPr>
+        <w:lastRenderedPageBreak/>
+        <w:t xml:space="preserve">8. </w:t>
+      </w:r>
+      <w:r>
+        <w:rPr>
+          <w:b/>
+          <w:bCs/>
+          <w:sz w:val="28"/>
+          <w:szCs w:val="28"/>
+        </w:rPr>
+        <w:t>Conclusión:</w:t>
+      </w:r>
+    </w:p>
+    <w:p>
+      <w:pPr>
+        <w:spacing w:after="27" w:line="360" w:lineRule="auto"/>
+        <w:ind w:left="0" w:right="2" w:firstLine="0"/>
+        <w:rPr>
+          <w:sz w:val="22"/>
+          <w:szCs w:val="22"/>
+          <w:lang w:val="es-ES"/>
+        </w:rPr>
+      </w:pPr>
+      <w:r>
+        <w:rPr>
+          <w:b/>
+          <w:bCs/>
+          <w:sz w:val="22"/>
+          <w:szCs w:val="22"/>
+          <w:lang w:val="es-ES"/>
+        </w:rPr>
+        <w:t>Conclusión</w:t>
+      </w:r>
+    </w:p>
+    <w:p>
+      <w:pPr>
+        <w:spacing w:after="27" w:line="360" w:lineRule="auto"/>
+        <w:ind w:left="0" w:right="2" w:firstLine="0"/>
+        <w:rPr>
+          <w:sz w:val="22"/>
+          <w:szCs w:val="22"/>
+          <w:lang w:val="es-ES"/>
+        </w:rPr>
+      </w:pPr>
+      <w:r>
+        <w:rPr>
+          <w:sz w:val="22"/>
+          <w:szCs w:val="22"/>
+          <w:lang w:val="es-ES"/>
+        </w:rPr>
+        <w:t>En este trabajo se presentó una propuesta relacionada con el desarrollo de un sistema de gestión de citas médicas, con la intención de mejorar la organización y el manejo de la información dentro de un centro de salud. A lo largo del documento se explicó el problema que puede surgir cuando las citas y los datos de los pacientes se manejan de manera manual o con procesos poco organizados.</w:t>
+      </w:r>
+    </w:p>
+    <w:p>
+      <w:pPr>
+        <w:spacing w:after="27" w:line="360" w:lineRule="auto"/>
+        <w:ind w:left="0" w:right="2" w:firstLine="0"/>
+        <w:rPr>
+          <w:sz w:val="22"/>
+          <w:szCs w:val="22"/>
+          <w:lang w:val="es-ES"/>
+        </w:rPr>
+      </w:pPr>
+      <w:r>
+        <w:rPr>
+          <w:sz w:val="22"/>
+          <w:szCs w:val="22"/>
+          <w:lang w:val="es-ES"/>
+        </w:rPr>
+        <w:t>Para poder entender mejor la situación, primero se abordó la introducción del tema y la definición del proyecto, donde se explicó la idea general del sistema y la necesidad de contar con una herramienta que ayude a organizar las citas médicas. Luego se analizaron algunos aspectos relacionados con el contexto del problema y la forma en que actualmente se manejan estos procesos.</w:t>
+      </w:r>
+    </w:p>
+    <w:p>
+      <w:pPr>
+        <w:spacing w:after="27" w:line="360" w:lineRule="auto"/>
+        <w:ind w:left="0" w:right="2" w:firstLine="0"/>
+        <w:rPr>
+          <w:sz w:val="22"/>
+          <w:szCs w:val="22"/>
+          <w:lang w:val="es-ES"/>
+        </w:rPr>
+      </w:pPr>
+      <w:r>
+        <w:rPr>
+          <w:sz w:val="22"/>
+          <w:szCs w:val="22"/>
+          <w:lang w:val="es-ES"/>
+        </w:rPr>
+        <w:t>También se tomaron en cuenta diferentes elementos presentados en los apartados del trabajo, como el análisis del problema, los objetivos del proyecto y el cronograma de actividades. Estos pasos permitieron tener una visión más clara sobre cómo se puede planificar el desarrollo de un sistema y cuáles serían las etapas necesarias para poder llevarlo a cabo.</w:t>
+      </w:r>
+    </w:p>
+    <w:p>
+      <w:pPr>
+        <w:spacing w:after="27" w:line="360" w:lineRule="auto"/>
+        <w:ind w:left="0" w:right="2" w:firstLine="0"/>
+        <w:rPr>
+          <w:sz w:val="22"/>
+          <w:szCs w:val="22"/>
+          <w:lang w:val="es-ES"/>
+        </w:rPr>
+      </w:pPr>
+      <w:r>
+        <w:rPr>
+          <w:sz w:val="22"/>
+          <w:szCs w:val="22"/>
+          <w:lang w:val="es-ES"/>
+        </w:rPr>
+        <w:t>En general, el desarrollo de este trabajo permitió comprender mejor cómo se puede aplicar un sistema de información para resolver una situación real. Aunque se trata de una propuesta inicial, se pudo observar que el uso de la tecnología puede contribuir a mejorar la organización de las citas médicas y el manejo de la información.</w:t>
+      </w:r>
+    </w:p>
+    <w:p>
+      <w:pPr>
+        <w:spacing w:after="27" w:line="360" w:lineRule="auto"/>
+        <w:ind w:left="0" w:right="2" w:firstLine="0"/>
+        <w:rPr>
+          <w:sz w:val="22"/>
+          <w:szCs w:val="22"/>
+          <w:lang w:val="es-ES"/>
+        </w:rPr>
+      </w:pPr>
+      <w:r>
+        <w:rPr>
+          <w:sz w:val="22"/>
+          <w:szCs w:val="22"/>
+          <w:lang w:val="es-ES"/>
+        </w:rPr>
+        <w:t>Finalmente, se puede decir que mediante el análisis realizado en cada uno de los apartados del trabajo fue posible presentar una idea de solución que podría ayudar a mejorar el funcionamiento de este tipo de servicios. Con una buena planificación y el uso adecuado de herramientas tecnológicas, es posible lograr un sistema más organizado y eficiente.</w:t>
+      </w:r>
+    </w:p>
+    <w:p>
+      <w:pPr>
+        <w:spacing w:after="27" w:line="360" w:lineRule="auto"/>
+        <w:ind w:left="0" w:right="2" w:firstLine="0"/>
+        <w:rPr>
+          <w:sz w:val="22"/>
+          <w:szCs w:val="22"/>
+        </w:rPr>
+      </w:pPr>
     </w:p>
     <w:sectPr>
       <w:headerReference w:type="even" r:id="rId12"/>
@@ -3089,7 +3187,7 @@
 </file>
 
 <file path=word/endnotes.xml><?xml version="1.0" encoding="utf-8"?>
-<w:endnotes xmlns:wpc="http://schemas.microsoft.com/office/word/2010/wordprocessingCanvas" xmlns:cx="http://schemas.microsoft.com/office/drawing/2014/chartex" xmlns:cx1="http://schemas.microsoft.com/office/drawing/2015/9/8/chartex" xmlns:cx2="http://schemas.microsoft.com/office/drawing/2015/10/21/chartex" xmlns:cx3="http://schemas.microsoft.com/office/drawing/2016/5/9/chartex" xmlns:cx4="http://schemas.microsoft.com/office/drawing/2016/5/10/chartex" xmlns:cx5="http://schemas.microsoft.com/office/drawing/2016/5/11/chartex" xmlns:cx6="http://schemas.microsoft.com/office/drawing/2016/5/12/chartex" xmlns:cx7="http://schemas.microsoft.com/office/drawing/2016/5/13/chartex" xmlns:cx8="http://schemas.microsoft.com/office/drawing/2016/5/14/chartex" xmlns:mc="http://schemas.openxmlformats.org/markup-compatibility/2006" xmlns:aink="http://schemas.microsoft.com/office/drawing/2016/ink" xmlns:am3d="http://schemas.microsoft.com/office/drawing/2017/model3d" xmlns:o="urn:schemas-microsoft-com:office:office" xmlns:oel="http://schemas.microsoft.com/office/2019/extlst" xmlns:r="http://schemas.openxmlformats.org/officeDocument/2006/relationships" xmlns:m="http://schemas.openxmlformats.org/officeDocument/2006/math" xmlns:v="urn:schemas-microsoft-com:vml" xmlns:wp14="http://schemas.microsoft.com/office/word/2010/wordprocessingDrawing" xmlns:wp="http://schemas.openxmlformats.org/drawingml/2006/wordprocessingDrawing" xmlns:w10="urn:schemas-microsoft-com:office:word" xmlns:w="http://schemas.openxmlformats.org/wordprocessingml/2006/main" xmlns:w14="http://schemas.microsoft.com/office/word/2010/wordml" xmlns:w15="http://schemas.microsoft.com/office/word/2012/wordml" xmlns:w16cex="http://schemas.microsoft.com/office/word/2018/wordml/cex" xmlns:w16cid="http://schemas.microsoft.com/office/word/2016/wordml/cid" xmlns:w16="http://schemas.microsoft.com/office/word/2018/wordml" xmlns:w16du="http://schemas.microsoft.com/office/word/2023/wordml/word16du" xmlns:w16sdtdh="http://schemas.microsoft.com/office/word/2020/wordml/sdtdatahash" xmlns:w16se="http://schemas.microsoft.com/office/word/2015/wordml/symex" xmlns:wpg="http://schemas.microsoft.com/office/word/2010/wordprocessingGroup" xmlns:wpi="http://schemas.microsoft.com/office/word/2010/wordprocessingInk" xmlns:wne="http://schemas.microsoft.com/office/word/2006/wordml" xmlns:wps="http://schemas.microsoft.com/office/word/2010/wordprocessingShape" mc:Ignorable="w14 w15 w16se w16cid w16 w16cex w16sdtdh w16du wp14">
+<w:endnotes xmlns:wpc="http://schemas.microsoft.com/office/word/2010/wordprocessingCanvas" xmlns:cx="http://schemas.microsoft.com/office/drawing/2014/chartex" xmlns:cx1="http://schemas.microsoft.com/office/drawing/2015/9/8/chartex" xmlns:cx2="http://schemas.microsoft.com/office/drawing/2015/10/21/chartex" xmlns:cx3="http://schemas.microsoft.com/office/drawing/2016/5/9/chartex" xmlns:cx4="http://schemas.microsoft.com/office/drawing/2016/5/10/chartex" xmlns:cx5="http://schemas.microsoft.com/office/drawing/2016/5/11/chartex" xmlns:cx6="http://schemas.microsoft.com/office/drawing/2016/5/12/chartex" xmlns:cx7="http://schemas.microsoft.com/office/drawing/2016/5/13/chartex" xmlns:cx8="http://schemas.microsoft.com/office/drawing/2016/5/14/chartex" xmlns:mc="http://schemas.openxmlformats.org/markup-compatibility/2006" xmlns:aink="http://schemas.microsoft.com/office/drawing/2016/ink" xmlns:am3d="http://schemas.microsoft.com/office/drawing/2017/model3d" xmlns:o="urn:schemas-microsoft-com:office:office" xmlns:oel="http://schemas.microsoft.com/office/2019/extlst" xmlns:r="http://schemas.openxmlformats.org/officeDocument/2006/relationships" xmlns:m="http://schemas.openxmlformats.org/officeDocument/2006/math" xmlns:v="urn:schemas-microsoft-com:vml" xmlns:wp14="http://schemas.microsoft.com/office/word/2010/wordprocessingDrawing" xmlns:wp="http://schemas.openxmlformats.org/drawingml/2006/wordprocessingDrawing" xmlns:w10="urn:schemas-microsoft-com:office:word" xmlns:w="http://schemas.openxmlformats.org/wordprocessingml/2006/main" xmlns:w14="http://schemas.microsoft.com/office/word/2010/wordml" xmlns:w15="http://schemas.microsoft.com/office/word/2012/wordml" xmlns:w16cex="http://schemas.microsoft.com/office/word/2018/wordml/cex" xmlns:w16cid="http://schemas.microsoft.com/office/word/2016/wordml/cid" xmlns:w16="http://schemas.microsoft.com/office/word/2018/wordml" xmlns:w16du="http://schemas.microsoft.com/office/word/2023/wordml/word16du" xmlns:w16sdtdh="http://schemas.microsoft.com/office/word/2020/wordml/sdtdatahash" xmlns:w16sdtfl="http://schemas.microsoft.com/office/word/2024/wordml/sdtformatlock" xmlns:w16se="http://schemas.microsoft.com/office/word/2015/wordml/symex" xmlns:wpg="http://schemas.microsoft.com/office/word/2010/wordprocessingGroup" xmlns:wpi="http://schemas.microsoft.com/office/word/2010/wordprocessingInk" xmlns:wne="http://schemas.microsoft.com/office/word/2006/wordml" xmlns:wps="http://schemas.microsoft.com/office/word/2010/wordprocessingShape" mc:Ignorable="w14 w15 w16se w16cid w16 w16cex w16sdtdh w16sdtfl w16du wp14">
   <w:endnote w:type="separator" w:id="-1">
     <w:p>
       <w:pPr>
@@ -3114,7 +3212,7 @@
 </file>
 
 <file path=word/footnotes.xml><?xml version="1.0" encoding="utf-8"?>
-<w:footnotes xmlns:wpc="http://schemas.microsoft.com/office/word/2010/wordprocessingCanvas" xmlns:cx="http://schemas.microsoft.com/office/drawing/2014/chartex" xmlns:cx1="http://schemas.microsoft.com/office/drawing/2015/9/8/chartex" xmlns:cx2="http://schemas.microsoft.com/office/drawing/2015/10/21/chartex" xmlns:cx3="http://schemas.microsoft.com/office/drawing/2016/5/9/chartex" xmlns:cx4="http://schemas.microsoft.com/office/drawing/2016/5/10/chartex" xmlns:cx5="http://schemas.microsoft.com/office/drawing/2016/5/11/chartex" xmlns:cx6="http://schemas.microsoft.com/office/drawing/2016/5/12/chartex" xmlns:cx7="http://schemas.microsoft.com/office/drawing/2016/5/13/chartex" xmlns:cx8="http://schemas.microsoft.com/office/drawing/2016/5/14/chartex" xmlns:mc="http://schemas.openxmlformats.org/markup-compatibility/2006" xmlns:aink="http://schemas.microsoft.com/office/drawing/2016/ink" xmlns:am3d="http://schemas.microsoft.com/office/drawing/2017/model3d" xmlns:o="urn:schemas-microsoft-com:office:office" xmlns:oel="http://schemas.microsoft.com/office/2019/extlst" xmlns:r="http://schemas.openxmlformats.org/officeDocument/2006/relationships" xmlns:m="http://schemas.openxmlformats.org/officeDocument/2006/math" xmlns:v="urn:schemas-microsoft-com:vml" xmlns:wp14="http://schemas.microsoft.com/office/word/2010/wordprocessingDrawing" xmlns:wp="http://schemas.openxmlformats.org/drawingml/2006/wordprocessingDrawing" xmlns:w10="urn:schemas-microsoft-com:office:word" xmlns:w="http://schemas.openxmlformats.org/wordprocessingml/2006/main" xmlns:w14="http://schemas.microsoft.com/office/word/2010/wordml" xmlns:w15="http://schemas.microsoft.com/office/word/2012/wordml" xmlns:w16cex="http://schemas.microsoft.com/office/word/2018/wordml/cex" xmlns:w16cid="http://schemas.microsoft.com/office/word/2016/wordml/cid" xmlns:w16="http://schemas.microsoft.com/office/word/2018/wordml" xmlns:w16du="http://schemas.microsoft.com/office/word/2023/wordml/word16du" xmlns:w16sdtdh="http://schemas.microsoft.com/office/word/2020/wordml/sdtdatahash" xmlns:w16se="http://schemas.microsoft.com/office/word/2015/wordml/symex" xmlns:wpg="http://schemas.microsoft.com/office/word/2010/wordprocessingGroup" xmlns:wpi="http://schemas.microsoft.com/office/word/2010/wordprocessingInk" xmlns:wne="http://schemas.microsoft.com/office/word/2006/wordml" xmlns:wps="http://schemas.microsoft.com/office/word/2010/wordprocessingShape" mc:Ignorable="w14 w15 w16se w16cid w16 w16cex w16sdtdh w16du wp14">
+<w:footnotes xmlns:wpc="http://schemas.microsoft.com/office/word/2010/wordprocessingCanvas" xmlns:cx="http://schemas.microsoft.com/office/drawing/2014/chartex" xmlns:cx1="http://schemas.microsoft.com/office/drawing/2015/9/8/chartex" xmlns:cx2="http://schemas.microsoft.com/office/drawing/2015/10/21/chartex" xmlns:cx3="http://schemas.microsoft.com/office/drawing/2016/5/9/chartex" xmlns:cx4="http://schemas.microsoft.com/office/drawing/2016/5/10/chartex" xmlns:cx5="http://schemas.microsoft.com/office/drawing/2016/5/11/chartex" xmlns:cx6="http://schemas.microsoft.com/office/drawing/2016/5/12/chartex" xmlns:cx7="http://schemas.microsoft.com/office/drawing/2016/5/13/chartex" xmlns:cx8="http://schemas.microsoft.com/office/drawing/2016/5/14/chartex" xmlns:mc="http://schemas.openxmlformats.org/markup-compatibility/2006" xmlns:aink="http://schemas.microsoft.com/office/drawing/2016/ink" xmlns:am3d="http://schemas.microsoft.com/office/drawing/2017/model3d" xmlns:o="urn:schemas-microsoft-com:office:office" xmlns:oel="http://schemas.microsoft.com/office/2019/extlst" xmlns:r="http://schemas.openxmlformats.org/officeDocument/2006/relationships" xmlns:m="http://schemas.openxmlformats.org/officeDocument/2006/math" xmlns:v="urn:schemas-microsoft-com:vml" xmlns:wp14="http://schemas.microsoft.com/office/word/2010/wordprocessingDrawing" xmlns:wp="http://schemas.openxmlformats.org/drawingml/2006/wordprocessingDrawing" xmlns:w10="urn:schemas-microsoft-com:office:word" xmlns:w="http://schemas.openxmlformats.org/wordprocessingml/2006/main" xmlns:w14="http://schemas.microsoft.com/office/word/2010/wordml" xmlns:w15="http://schemas.microsoft.com/office/word/2012/wordml" xmlns:w16cex="http://schemas.microsoft.com/office/word/2018/wordml/cex" xmlns:w16cid="http://schemas.microsoft.com/office/word/2016/wordml/cid" xmlns:w16="http://schemas.microsoft.com/office/word/2018/wordml" xmlns:w16du="http://schemas.microsoft.com/office/word/2023/wordml/word16du" xmlns:w16sdtdh="http://schemas.microsoft.com/office/word/2020/wordml/sdtdatahash" xmlns:w16sdtfl="http://schemas.microsoft.com/office/word/2024/wordml/sdtformatlock" xmlns:w16se="http://schemas.microsoft.com/office/word/2015/wordml/symex" xmlns:wpg="http://schemas.microsoft.com/office/word/2010/wordprocessingGroup" xmlns:wpi="http://schemas.microsoft.com/office/word/2010/wordprocessingInk" xmlns:wne="http://schemas.microsoft.com/office/word/2006/wordml" xmlns:wps="http://schemas.microsoft.com/office/word/2010/wordprocessingShape" mc:Ignorable="w14 w15 w16se w16cid w16 w16cex w16sdtdh w16sdtfl w16du wp14">
   <w:footnote w:type="separator" w:id="-1">
     <w:p>
       <w:pPr>
@@ -3139,7 +3237,7 @@
 </file>
 
 <file path=word/header1.xml><?xml version="1.0" encoding="utf-8"?>
-<w:hdr xmlns:wpc="http://schemas.microsoft.com/office/word/2010/wordprocessingCanvas" xmlns:cx="http://schemas.microsoft.com/office/drawing/2014/chartex" xmlns:cx1="http://schemas.microsoft.com/office/drawing/2015/9/8/chartex" xmlns:cx2="http://schemas.microsoft.com/office/drawing/2015/10/21/chartex" xmlns:cx3="http://schemas.microsoft.com/office/drawing/2016/5/9/chartex" xmlns:cx4="http://schemas.microsoft.com/office/drawing/2016/5/10/chartex" xmlns:cx5="http://schemas.microsoft.com/office/drawing/2016/5/11/chartex" xmlns:cx6="http://schemas.microsoft.com/office/drawing/2016/5/12/chartex" xmlns:cx7="http://schemas.microsoft.com/office/drawing/2016/5/13/chartex" xmlns:cx8="http://schemas.microsoft.com/office/drawing/2016/5/14/chartex" xmlns:mc="http://schemas.openxmlformats.org/markup-compatibility/2006" xmlns:aink="http://schemas.microsoft.com/office/drawing/2016/ink" xmlns:am3d="http://schemas.microsoft.com/office/drawing/2017/model3d" xmlns:o="urn:schemas-microsoft-com:office:office" xmlns:oel="http://schemas.microsoft.com/office/2019/extlst" xmlns:r="http://schemas.openxmlformats.org/officeDocument/2006/relationships" xmlns:m="http://schemas.openxmlformats.org/officeDocument/2006/math" xmlns:v="urn:schemas-microsoft-com:vml" xmlns:wp14="http://schemas.microsoft.com/office/word/2010/wordprocessingDrawing" xmlns:wp="http://schemas.openxmlformats.org/drawingml/2006/wordprocessingDrawing" xmlns:w10="urn:schemas-microsoft-com:office:word" xmlns:w="http://schemas.openxmlformats.org/wordprocessingml/2006/main" xmlns:w14="http://schemas.microsoft.com/office/word/2010/wordml" xmlns:w15="http://schemas.microsoft.com/office/word/2012/wordml" xmlns:w16cex="http://schemas.microsoft.com/office/word/2018/wordml/cex" xmlns:w16cid="http://schemas.microsoft.com/office/word/2016/wordml/cid" xmlns:w16="http://schemas.microsoft.com/office/word/2018/wordml" xmlns:w16du="http://schemas.microsoft.com/office/word/2023/wordml/word16du" xmlns:w16sdtdh="http://schemas.microsoft.com/office/word/2020/wordml/sdtdatahash" xmlns:w16se="http://schemas.microsoft.com/office/word/2015/wordml/symex" xmlns:wpg="http://schemas.microsoft.com/office/word/2010/wordprocessingGroup" xmlns:wpi="http://schemas.microsoft.com/office/word/2010/wordprocessingInk" xmlns:wne="http://schemas.microsoft.com/office/word/2006/wordml" xmlns:wps="http://schemas.microsoft.com/office/word/2010/wordprocessingShape" mc:Ignorable="w14 w15 w16se w16cid w16 w16cex w16sdtdh w16du wp14">
+<w:hdr xmlns:wpc="http://schemas.microsoft.com/office/word/2010/wordprocessingCanvas" xmlns:cx="http://schemas.microsoft.com/office/drawing/2014/chartex" xmlns:cx1="http://schemas.microsoft.com/office/drawing/2015/9/8/chartex" xmlns:cx2="http://schemas.microsoft.com/office/drawing/2015/10/21/chartex" xmlns:cx3="http://schemas.microsoft.com/office/drawing/2016/5/9/chartex" xmlns:cx4="http://schemas.microsoft.com/office/drawing/2016/5/10/chartex" xmlns:cx5="http://schemas.microsoft.com/office/drawing/2016/5/11/chartex" xmlns:cx6="http://schemas.microsoft.com/office/drawing/2016/5/12/chartex" xmlns:cx7="http://schemas.microsoft.com/office/drawing/2016/5/13/chartex" xmlns:cx8="http://schemas.microsoft.com/office/drawing/2016/5/14/chartex" xmlns:mc="http://schemas.openxmlformats.org/markup-compatibility/2006" xmlns:aink="http://schemas.microsoft.com/office/drawing/2016/ink" xmlns:am3d="http://schemas.microsoft.com/office/drawing/2017/model3d" xmlns:o="urn:schemas-microsoft-com:office:office" xmlns:oel="http://schemas.microsoft.com/office/2019/extlst" xmlns:r="http://schemas.openxmlformats.org/officeDocument/2006/relationships" xmlns:m="http://schemas.openxmlformats.org/officeDocument/2006/math" xmlns:v="urn:schemas-microsoft-com:vml" xmlns:wp14="http://schemas.microsoft.com/office/word/2010/wordprocessingDrawing" xmlns:wp="http://schemas.openxmlformats.org/drawingml/2006/wordprocessingDrawing" xmlns:w10="urn:schemas-microsoft-com:office:word" xmlns:w="http://schemas.openxmlformats.org/wordprocessingml/2006/main" xmlns:w14="http://schemas.microsoft.com/office/word/2010/wordml" xmlns:w15="http://schemas.microsoft.com/office/word/2012/wordml" xmlns:w16cex="http://schemas.microsoft.com/office/word/2018/wordml/cex" xmlns:w16cid="http://schemas.microsoft.com/office/word/2016/wordml/cid" xmlns:w16="http://schemas.microsoft.com/office/word/2018/wordml" xmlns:w16du="http://schemas.microsoft.com/office/word/2023/wordml/word16du" xmlns:w16sdtdh="http://schemas.microsoft.com/office/word/2020/wordml/sdtdatahash" xmlns:w16sdtfl="http://schemas.microsoft.com/office/word/2024/wordml/sdtformatlock" xmlns:w16se="http://schemas.microsoft.com/office/word/2015/wordml/symex" xmlns:wpg="http://schemas.microsoft.com/office/word/2010/wordprocessingGroup" xmlns:wpi="http://schemas.microsoft.com/office/word/2010/wordprocessingInk" xmlns:wne="http://schemas.microsoft.com/office/word/2006/wordml" xmlns:wps="http://schemas.microsoft.com/office/word/2010/wordprocessingShape" mc:Ignorable="w14 w15 w16se w16cid w16 w16cex w16sdtdh w16sdtfl w16du wp14">
   <w:p>
     <w:pPr>
       <w:spacing w:after="160" w:line="259" w:lineRule="auto"/>
@@ -3151,7 +3249,7 @@
 </file>
 
 <file path=word/header2.xml><?xml version="1.0" encoding="utf-8"?>
-<w:hdr xmlns:wpc="http://schemas.microsoft.com/office/word/2010/wordprocessingCanvas" xmlns:cx="http://schemas.microsoft.com/office/drawing/2014/chartex" xmlns:cx1="http://schemas.microsoft.com/office/drawing/2015/9/8/chartex" xmlns:cx2="http://schemas.microsoft.com/office/drawing/2015/10/21/chartex" xmlns:cx3="http://schemas.microsoft.com/office/drawing/2016/5/9/chartex" xmlns:cx4="http://schemas.microsoft.com/office/drawing/2016/5/10/chartex" xmlns:cx5="http://schemas.microsoft.com/office/drawing/2016/5/11/chartex" xmlns:cx6="http://schemas.microsoft.com/office/drawing/2016/5/12/chartex" xmlns:cx7="http://schemas.microsoft.com/office/drawing/2016/5/13/chartex" xmlns:cx8="http://schemas.microsoft.com/office/drawing/2016/5/14/chartex" xmlns:mc="http://schemas.openxmlformats.org/markup-compatibility/2006" xmlns:aink="http://schemas.microsoft.com/office/drawing/2016/ink" xmlns:am3d="http://schemas.microsoft.com/office/drawing/2017/model3d" xmlns:o="urn:schemas-microsoft-com:office:office" xmlns:oel="http://schemas.microsoft.com/office/2019/extlst" xmlns:r="http://schemas.openxmlformats.org/officeDocument/2006/relationships" xmlns:m="http://schemas.openxmlformats.org/officeDocument/2006/math" xmlns:v="urn:schemas-microsoft-com:vml" xmlns:wp14="http://schemas.microsoft.com/office/word/2010/wordprocessingDrawing" xmlns:wp="http://schemas.openxmlformats.org/drawingml/2006/wordprocessingDrawing" xmlns:w10="urn:schemas-microsoft-com:office:word" xmlns:w="http://schemas.openxmlformats.org/wordprocessingml/2006/main" xmlns:w14="http://schemas.microsoft.com/office/word/2010/wordml" xmlns:w15="http://schemas.microsoft.com/office/word/2012/wordml" xmlns:w16cex="http://schemas.microsoft.com/office/word/2018/wordml/cex" xmlns:w16cid="http://schemas.microsoft.com/office/word/2016/wordml/cid" xmlns:w16="http://schemas.microsoft.com/office/word/2018/wordml" xmlns:w16du="http://schemas.microsoft.com/office/word/2023/wordml/word16du" xmlns:w16sdtdh="http://schemas.microsoft.com/office/word/2020/wordml/sdtdatahash" xmlns:w16se="http://schemas.microsoft.com/office/word/2015/wordml/symex" xmlns:wpg="http://schemas.microsoft.com/office/word/2010/wordprocessingGroup" xmlns:wpi="http://schemas.microsoft.com/office/word/2010/wordprocessingInk" xmlns:wne="http://schemas.microsoft.com/office/word/2006/wordml" xmlns:wps="http://schemas.microsoft.com/office/word/2010/wordprocessingShape" mc:Ignorable="w14 w15 w16se w16cid w16 w16cex w16sdtdh w16du wp14">
+<w:hdr xmlns:wpc="http://schemas.microsoft.com/office/word/2010/wordprocessingCanvas" xmlns:cx="http://schemas.microsoft.com/office/drawing/2014/chartex" xmlns:cx1="http://schemas.microsoft.com/office/drawing/2015/9/8/chartex" xmlns:cx2="http://schemas.microsoft.com/office/drawing/2015/10/21/chartex" xmlns:cx3="http://schemas.microsoft.com/office/drawing/2016/5/9/chartex" xmlns:cx4="http://schemas.microsoft.com/office/drawing/2016/5/10/chartex" xmlns:cx5="http://schemas.microsoft.com/office/drawing/2016/5/11/chartex" xmlns:cx6="http://schemas.microsoft.com/office/drawing/2016/5/12/chartex" xmlns:cx7="http://schemas.microsoft.com/office/drawing/2016/5/13/chartex" xmlns:cx8="http://schemas.microsoft.com/office/drawing/2016/5/14/chartex" xmlns:mc="http://schemas.openxmlformats.org/markup-compatibility/2006" xmlns:aink="http://schemas.microsoft.com/office/drawing/2016/ink" xmlns:am3d="http://schemas.microsoft.com/office/drawing/2017/model3d" xmlns:o="urn:schemas-microsoft-com:office:office" xmlns:oel="http://schemas.microsoft.com/office/2019/extlst" xmlns:r="http://schemas.openxmlformats.org/officeDocument/2006/relationships" xmlns:m="http://schemas.openxmlformats.org/officeDocument/2006/math" xmlns:v="urn:schemas-microsoft-com:vml" xmlns:wp14="http://schemas.microsoft.com/office/word/2010/wordprocessingDrawing" xmlns:wp="http://schemas.openxmlformats.org/drawingml/2006/wordprocessingDrawing" xmlns:w10="urn:schemas-microsoft-com:office:word" xmlns:w="http://schemas.openxmlformats.org/wordprocessingml/2006/main" xmlns:w14="http://schemas.microsoft.com/office/word/2010/wordml" xmlns:w15="http://schemas.microsoft.com/office/word/2012/wordml" xmlns:w16cex="http://schemas.microsoft.com/office/word/2018/wordml/cex" xmlns:w16cid="http://schemas.microsoft.com/office/word/2016/wordml/cid" xmlns:w16="http://schemas.microsoft.com/office/word/2018/wordml" xmlns:w16du="http://schemas.microsoft.com/office/word/2023/wordml/word16du" xmlns:w16sdtdh="http://schemas.microsoft.com/office/word/2020/wordml/sdtdatahash" xmlns:w16sdtfl="http://schemas.microsoft.com/office/word/2024/wordml/sdtformatlock" xmlns:w16se="http://schemas.microsoft.com/office/word/2015/wordml/symex" xmlns:wpg="http://schemas.microsoft.com/office/word/2010/wordprocessingGroup" xmlns:wpi="http://schemas.microsoft.com/office/word/2010/wordprocessingInk" xmlns:wne="http://schemas.microsoft.com/office/word/2006/wordml" xmlns:wps="http://schemas.microsoft.com/office/word/2010/wordprocessingShape" mc:Ignorable="w14 w15 w16se w16cid w16 w16cex w16sdtdh w16sdtfl w16du wp14">
   <w:p>
     <w:pPr>
       <w:spacing w:after="160" w:line="259" w:lineRule="auto"/>
@@ -3163,7 +3261,7 @@
 </file>
 
 <file path=word/header3.xml><?xml version="1.0" encoding="utf-8"?>
-<w:hdr xmlns:wpc="http://schemas.microsoft.com/office/word/2010/wordprocessingCanvas" xmlns:cx="http://schemas.microsoft.com/office/drawing/2014/chartex" xmlns:cx1="http://schemas.microsoft.com/office/drawing/2015/9/8/chartex" xmlns:cx2="http://schemas.microsoft.com/office/drawing/2015/10/21/chartex" xmlns:cx3="http://schemas.microsoft.com/office/drawing/2016/5/9/chartex" xmlns:cx4="http://schemas.microsoft.com/office/drawing/2016/5/10/chartex" xmlns:cx5="http://schemas.microsoft.com/office/drawing/2016/5/11/chartex" xmlns:cx6="http://schemas.microsoft.com/office/drawing/2016/5/12/chartex" xmlns:cx7="http://schemas.microsoft.com/office/drawing/2016/5/13/chartex" xmlns:cx8="http://schemas.microsoft.com/office/drawing/2016/5/14/chartex" xmlns:mc="http://schemas.openxmlformats.org/markup-compatibility/2006" xmlns:aink="http://schemas.microsoft.com/office/drawing/2016/ink" xmlns:am3d="http://schemas.microsoft.com/office/drawing/2017/model3d" xmlns:o="urn:schemas-microsoft-com:office:office" xmlns:oel="http://schemas.microsoft.com/office/2019/extlst" xmlns:r="http://schemas.openxmlformats.org/officeDocument/2006/relationships" xmlns:m="http://schemas.openxmlformats.org/officeDocument/2006/math" xmlns:v="urn:schemas-microsoft-com:vml" xmlns:wp14="http://schemas.microsoft.com/office/word/2010/wordprocessingDrawing" xmlns:wp="http://schemas.openxmlformats.org/drawingml/2006/wordprocessingDrawing" xmlns:w10="urn:schemas-microsoft-com:office:word" xmlns:w="http://schemas.openxmlformats.org/wordprocessingml/2006/main" xmlns:w14="http://schemas.microsoft.com/office/word/2010/wordml" xmlns:w15="http://schemas.microsoft.com/office/word/2012/wordml" xmlns:w16cex="http://schemas.microsoft.com/office/word/2018/wordml/cex" xmlns:w16cid="http://schemas.microsoft.com/office/word/2016/wordml/cid" xmlns:w16="http://schemas.microsoft.com/office/word/2018/wordml" xmlns:w16du="http://schemas.microsoft.com/office/word/2023/wordml/word16du" xmlns:w16sdtdh="http://schemas.microsoft.com/office/word/2020/wordml/sdtdatahash" xmlns:w16se="http://schemas.microsoft.com/office/word/2015/wordml/symex" xmlns:wpg="http://schemas.microsoft.com/office/word/2010/wordprocessingGroup" xmlns:wpi="http://schemas.microsoft.com/office/word/2010/wordprocessingInk" xmlns:wne="http://schemas.microsoft.com/office/word/2006/wordml" xmlns:wps="http://schemas.microsoft.com/office/word/2010/wordprocessingShape" mc:Ignorable="w14 w15 w16se w16cid w16 w16cex w16sdtdh w16du wp14">
+<w:hdr xmlns:wpc="http://schemas.microsoft.com/office/word/2010/wordprocessingCanvas" xmlns:cx="http://schemas.microsoft.com/office/drawing/2014/chartex" xmlns:cx1="http://schemas.microsoft.com/office/drawing/2015/9/8/chartex" xmlns:cx2="http://schemas.microsoft.com/office/drawing/2015/10/21/chartex" xmlns:cx3="http://schemas.microsoft.com/office/drawing/2016/5/9/chartex" xmlns:cx4="http://schemas.microsoft.com/office/drawing/2016/5/10/chartex" xmlns:cx5="http://schemas.microsoft.com/office/drawing/2016/5/11/chartex" xmlns:cx6="http://schemas.microsoft.com/office/drawing/2016/5/12/chartex" xmlns:cx7="http://schemas.microsoft.com/office/drawing/2016/5/13/chartex" xmlns:cx8="http://schemas.microsoft.com/office/drawing/2016/5/14/chartex" xmlns:mc="http://schemas.openxmlformats.org/markup-compatibility/2006" xmlns:aink="http://schemas.microsoft.com/office/drawing/2016/ink" xmlns:am3d="http://schemas.microsoft.com/office/drawing/2017/model3d" xmlns:o="urn:schemas-microsoft-com:office:office" xmlns:oel="http://schemas.microsoft.com/office/2019/extlst" xmlns:r="http://schemas.openxmlformats.org/officeDocument/2006/relationships" xmlns:m="http://schemas.openxmlformats.org/officeDocument/2006/math" xmlns:v="urn:schemas-microsoft-com:vml" xmlns:wp14="http://schemas.microsoft.com/office/word/2010/wordprocessingDrawing" xmlns:wp="http://schemas.openxmlformats.org/drawingml/2006/wordprocessingDrawing" xmlns:w10="urn:schemas-microsoft-com:office:word" xmlns:w="http://schemas.openxmlformats.org/wordprocessingml/2006/main" xmlns:w14="http://schemas.microsoft.com/office/word/2010/wordml" xmlns:w15="http://schemas.microsoft.com/office/word/2012/wordml" xmlns:w16cex="http://schemas.microsoft.com/office/word/2018/wordml/cex" xmlns:w16cid="http://schemas.microsoft.com/office/word/2016/wordml/cid" xmlns:w16="http://schemas.microsoft.com/office/word/2018/wordml" xmlns:w16du="http://schemas.microsoft.com/office/word/2023/wordml/word16du" xmlns:w16sdtdh="http://schemas.microsoft.com/office/word/2020/wordml/sdtdatahash" xmlns:w16sdtfl="http://schemas.microsoft.com/office/word/2024/wordml/sdtformatlock" xmlns:w16se="http://schemas.microsoft.com/office/word/2015/wordml/symex" xmlns:wpg="http://schemas.microsoft.com/office/word/2010/wordprocessingGroup" xmlns:wpi="http://schemas.microsoft.com/office/word/2010/wordprocessingInk" xmlns:wne="http://schemas.microsoft.com/office/word/2006/wordml" xmlns:wps="http://schemas.microsoft.com/office/word/2010/wordprocessingShape" mc:Ignorable="w14 w15 w16se w16cid w16 w16cex w16sdtdh w16sdtfl w16du wp14">
   <w:p>
     <w:pPr>
       <w:spacing w:after="160" w:line="259" w:lineRule="auto"/>
@@ -3175,7 +3273,7 @@
 </file>
 
 <file path=word/numbering.xml><?xml version="1.0" encoding="utf-8"?>
-<w:numbering xmlns:wpc="http://schemas.microsoft.com/office/word/2010/wordprocessingCanvas" xmlns:cx="http://schemas.microsoft.com/office/drawing/2014/chartex" xmlns:cx1="http://schemas.microsoft.com/office/drawing/2015/9/8/chartex" xmlns:cx2="http://schemas.microsoft.com/office/drawing/2015/10/21/chartex" xmlns:cx3="http://schemas.microsoft.com/office/drawing/2016/5/9/chartex" xmlns:cx4="http://schemas.microsoft.com/office/drawing/2016/5/10/chartex" xmlns:cx5="http://schemas.microsoft.com/office/drawing/2016/5/11/chartex" xmlns:cx6="http://schemas.microsoft.com/office/drawing/2016/5/12/chartex" xmlns:cx7="http://schemas.microsoft.com/office/drawing/2016/5/13/chartex" xmlns:cx8="http://schemas.microsoft.com/office/drawing/2016/5/14/chartex" xmlns:mc="http://schemas.openxmlformats.org/markup-compatibility/2006" xmlns:aink="http://schemas.microsoft.com/office/drawing/2016/ink" xmlns:am3d="http://schemas.microsoft.com/office/drawing/2017/model3d" xmlns:o="urn:schemas-microsoft-com:office:office" xmlns:oel="http://schemas.microsoft.com/office/2019/extlst" xmlns:r="http://schemas.openxmlformats.org/officeDocument/2006/relationships" xmlns:m="http://schemas.openxmlformats.org/officeDocument/2006/math" xmlns:v="urn:schemas-microsoft-com:vml" xmlns:wp14="http://schemas.microsoft.com/office/word/2010/wordprocessingDrawing" xmlns:wp="http://schemas.openxmlformats.org/drawingml/2006/wordprocessingDrawing" xmlns:w10="urn:schemas-microsoft-com:office:word" xmlns:w="http://schemas.openxmlformats.org/wordprocessingml/2006/main" xmlns:w14="http://schemas.microsoft.com/office/word/2010/wordml" xmlns:w15="http://schemas.microsoft.com/office/word/2012/wordml" xmlns:w16cex="http://schemas.microsoft.com/office/word/2018/wordml/cex" xmlns:w16cid="http://schemas.microsoft.com/office/word/2016/wordml/cid" xmlns:w16="http://schemas.microsoft.com/office/word/2018/wordml" xmlns:w16du="http://schemas.microsoft.com/office/word/2023/wordml/word16du" xmlns:w16sdtdh="http://schemas.microsoft.com/office/word/2020/wordml/sdtdatahash" xmlns:w16se="http://schemas.microsoft.com/office/word/2015/wordml/symex" xmlns:wpg="http://schemas.microsoft.com/office/word/2010/wordprocessingGroup" xmlns:wpi="http://schemas.microsoft.com/office/word/2010/wordprocessingInk" xmlns:wne="http://schemas.microsoft.com/office/word/2006/wordml" xmlns:wps="http://schemas.microsoft.com/office/word/2010/wordprocessingShape" mc:Ignorable="w14 w15 w16se w16cid w16 w16cex w16sdtdh w16du wp14">
+<w:numbering xmlns:wpc="http://schemas.microsoft.com/office/word/2010/wordprocessingCanvas" xmlns:cx="http://schemas.microsoft.com/office/drawing/2014/chartex" xmlns:cx1="http://schemas.microsoft.com/office/drawing/2015/9/8/chartex" xmlns:cx2="http://schemas.microsoft.com/office/drawing/2015/10/21/chartex" xmlns:cx3="http://schemas.microsoft.com/office/drawing/2016/5/9/chartex" xmlns:cx4="http://schemas.microsoft.com/office/drawing/2016/5/10/chartex" xmlns:cx5="http://schemas.microsoft.com/office/drawing/2016/5/11/chartex" xmlns:cx6="http://schemas.microsoft.com/office/drawing/2016/5/12/chartex" xmlns:cx7="http://schemas.microsoft.com/office/drawing/2016/5/13/chartex" xmlns:cx8="http://schemas.microsoft.com/office/drawing/2016/5/14/chartex" xmlns:mc="http://schemas.openxmlformats.org/markup-compatibility/2006" xmlns:aink="http://schemas.microsoft.com/office/drawing/2016/ink" xmlns:am3d="http://schemas.microsoft.com/office/drawing/2017/model3d" xmlns:o="urn:schemas-microsoft-com:office:office" xmlns:oel="http://schemas.microsoft.com/office/2019/extlst" xmlns:r="http://schemas.openxmlformats.org/officeDocument/2006/relationships" xmlns:m="http://schemas.openxmlformats.org/officeDocument/2006/math" xmlns:v="urn:schemas-microsoft-com:vml" xmlns:wp14="http://schemas.microsoft.com/office/word/2010/wordprocessingDrawing" xmlns:wp="http://schemas.openxmlformats.org/drawingml/2006/wordprocessingDrawing" xmlns:w10="urn:schemas-microsoft-com:office:word" xmlns:w="http://schemas.openxmlformats.org/wordprocessingml/2006/main" xmlns:w14="http://schemas.microsoft.com/office/word/2010/wordml" xmlns:w15="http://schemas.microsoft.com/office/word/2012/wordml" xmlns:w16cex="http://schemas.microsoft.com/office/word/2018/wordml/cex" xmlns:w16cid="http://schemas.microsoft.com/office/word/2016/wordml/cid" xmlns:w16="http://schemas.microsoft.com/office/word/2018/wordml" xmlns:w16du="http://schemas.microsoft.com/office/word/2023/wordml/word16du" xmlns:w16sdtdh="http://schemas.microsoft.com/office/word/2020/wordml/sdtdatahash" xmlns:w16sdtfl="http://schemas.microsoft.com/office/word/2024/wordml/sdtformatlock" xmlns:w16se="http://schemas.microsoft.com/office/word/2015/wordml/symex" xmlns:wpg="http://schemas.microsoft.com/office/word/2010/wordprocessingGroup" xmlns:wpi="http://schemas.microsoft.com/office/word/2010/wordprocessingInk" xmlns:wne="http://schemas.microsoft.com/office/word/2006/wordml" xmlns:wps="http://schemas.microsoft.com/office/word/2010/wordprocessingShape" mc:Ignorable="w14 w15 w16se w16cid w16 w16cex w16sdtdh w16sdtfl w16du wp14">
   <w:abstractNum w:abstractNumId="0" w15:restartNumberingAfterBreak="0">
     <w:nsid w:val="0129403F"/>
     <w:multiLevelType w:val="hybridMultilevel"/>
@@ -3985,6 +4083,95 @@
     </w:lvl>
   </w:abstractNum>
   <w:abstractNum w:abstractNumId="5" w15:restartNumberingAfterBreak="0">
+    <w:nsid w:val="1BCF7DA0"/>
+    <w:multiLevelType w:val="hybridMultilevel"/>
+    <w:tmpl w:val="2AC07EA6"/>
+    <w:lvl w:ilvl="0" w:tplc="FFFFFFFF">
+      <w:start w:val="1"/>
+      <w:numFmt w:val="decimal"/>
+      <w:lvlText w:val="%1."/>
+      <w:lvlJc w:val="left"/>
+      <w:pPr>
+        <w:ind w:left="720" w:hanging="360"/>
+      </w:pPr>
+      <w:rPr>
+        <w:rFonts w:hint="default"/>
+      </w:rPr>
+    </w:lvl>
+    <w:lvl w:ilvl="1" w:tplc="0409000F">
+      <w:start w:val="1"/>
+      <w:numFmt w:val="decimal"/>
+      <w:lvlText w:val="%2."/>
+      <w:lvlJc w:val="left"/>
+      <w:pPr>
+        <w:ind w:left="1440" w:hanging="360"/>
+      </w:pPr>
+    </w:lvl>
+    <w:lvl w:ilvl="2" w:tplc="FFFFFFFF">
+      <w:start w:val="1"/>
+      <w:numFmt w:val="lowerRoman"/>
+      <w:lvlText w:val="%3."/>
+      <w:lvlJc w:val="right"/>
+      <w:pPr>
+        <w:ind w:left="2160" w:hanging="180"/>
+      </w:pPr>
+    </w:lvl>
+    <w:lvl w:ilvl="3" w:tplc="FFFFFFFF">
+      <w:start w:val="1"/>
+      <w:numFmt w:val="decimal"/>
+      <w:lvlText w:val="%4."/>
+      <w:lvlJc w:val="left"/>
+      <w:pPr>
+        <w:ind w:left="2880" w:hanging="360"/>
+      </w:pPr>
+    </w:lvl>
+    <w:lvl w:ilvl="4" w:tplc="FFFFFFFF" w:tentative="1">
+      <w:start w:val="1"/>
+      <w:numFmt w:val="lowerLetter"/>
+      <w:lvlText w:val="%5."/>
+      <w:lvlJc w:val="left"/>
+      <w:pPr>
+        <w:ind w:left="3600" w:hanging="360"/>
+      </w:pPr>
+    </w:lvl>
+    <w:lvl w:ilvl="5" w:tplc="FFFFFFFF" w:tentative="1">
+      <w:start w:val="1"/>
+      <w:numFmt w:val="lowerRoman"/>
+      <w:lvlText w:val="%6."/>
+      <w:lvlJc w:val="right"/>
+      <w:pPr>
+        <w:ind w:left="4320" w:hanging="180"/>
+      </w:pPr>
+    </w:lvl>
+    <w:lvl w:ilvl="6" w:tplc="FFFFFFFF" w:tentative="1">
+      <w:start w:val="1"/>
+      <w:numFmt w:val="decimal"/>
+      <w:lvlText w:val="%7."/>
+      <w:lvlJc w:val="left"/>
+      <w:pPr>
+        <w:ind w:left="5040" w:hanging="360"/>
+      </w:pPr>
+    </w:lvl>
+    <w:lvl w:ilvl="7" w:tplc="FFFFFFFF" w:tentative="1">
+      <w:start w:val="1"/>
+      <w:numFmt w:val="lowerLetter"/>
+      <w:lvlText w:val="%8."/>
+      <w:lvlJc w:val="left"/>
+      <w:pPr>
+        <w:ind w:left="5760" w:hanging="360"/>
+      </w:pPr>
+    </w:lvl>
+    <w:lvl w:ilvl="8" w:tplc="FFFFFFFF" w:tentative="1">
+      <w:start w:val="1"/>
+      <w:numFmt w:val="lowerRoman"/>
+      <w:lvlText w:val="%9."/>
+      <w:lvlJc w:val="right"/>
+      <w:pPr>
+        <w:ind w:left="6480" w:hanging="180"/>
+      </w:pPr>
+    </w:lvl>
+  </w:abstractNum>
+  <w:abstractNum w:abstractNumId="6" w15:restartNumberingAfterBreak="0">
     <w:nsid w:val="22B10B4D"/>
     <w:multiLevelType w:val="hybridMultilevel"/>
     <w:tmpl w:val="7CB0F3B8"/>
@@ -4196,7 +4383,7 @@
       </w:rPr>
     </w:lvl>
   </w:abstractNum>
-  <w:abstractNum w:abstractNumId="6" w15:restartNumberingAfterBreak="0">
+  <w:abstractNum w:abstractNumId="7" w15:restartNumberingAfterBreak="0">
     <w:nsid w:val="24F33748"/>
     <w:multiLevelType w:val="hybridMultilevel"/>
     <w:tmpl w:val="05224692"/>
@@ -4408,7 +4595,7 @@
       </w:rPr>
     </w:lvl>
   </w:abstractNum>
-  <w:abstractNum w:abstractNumId="7" w15:restartNumberingAfterBreak="0">
+  <w:abstractNum w:abstractNumId="8" w15:restartNumberingAfterBreak="0">
     <w:nsid w:val="2A7507D9"/>
     <w:multiLevelType w:val="hybridMultilevel"/>
     <w:tmpl w:val="88ACB76A"/>
@@ -4494,7 +4681,96 @@
       </w:pPr>
     </w:lvl>
   </w:abstractNum>
-  <w:abstractNum w:abstractNumId="8" w15:restartNumberingAfterBreak="0">
+  <w:abstractNum w:abstractNumId="9" w15:restartNumberingAfterBreak="0">
+    <w:nsid w:val="31BD5DCB"/>
+    <w:multiLevelType w:val="hybridMultilevel"/>
+    <w:tmpl w:val="32881620"/>
+    <w:lvl w:ilvl="0" w:tplc="0409000F">
+      <w:start w:val="1"/>
+      <w:numFmt w:val="decimal"/>
+      <w:lvlText w:val="%1."/>
+      <w:lvlJc w:val="left"/>
+      <w:pPr>
+        <w:ind w:left="720" w:hanging="360"/>
+      </w:pPr>
+      <w:rPr>
+        <w:rFonts w:hint="default"/>
+      </w:rPr>
+    </w:lvl>
+    <w:lvl w:ilvl="1" w:tplc="04090019">
+      <w:start w:val="1"/>
+      <w:numFmt w:val="lowerLetter"/>
+      <w:lvlText w:val="%2."/>
+      <w:lvlJc w:val="left"/>
+      <w:pPr>
+        <w:ind w:left="1440" w:hanging="360"/>
+      </w:pPr>
+    </w:lvl>
+    <w:lvl w:ilvl="2" w:tplc="0409001B">
+      <w:start w:val="1"/>
+      <w:numFmt w:val="lowerRoman"/>
+      <w:lvlText w:val="%3."/>
+      <w:lvlJc w:val="right"/>
+      <w:pPr>
+        <w:ind w:left="2160" w:hanging="180"/>
+      </w:pPr>
+    </w:lvl>
+    <w:lvl w:ilvl="3" w:tplc="0409000F">
+      <w:start w:val="1"/>
+      <w:numFmt w:val="decimal"/>
+      <w:lvlText w:val="%4."/>
+      <w:lvlJc w:val="left"/>
+      <w:pPr>
+        <w:ind w:left="2880" w:hanging="360"/>
+      </w:pPr>
+    </w:lvl>
+    <w:lvl w:ilvl="4" w:tplc="04090019" w:tentative="1">
+      <w:start w:val="1"/>
+      <w:numFmt w:val="lowerLetter"/>
+      <w:lvlText w:val="%5."/>
+      <w:lvlJc w:val="left"/>
+      <w:pPr>
+        <w:ind w:left="3600" w:hanging="360"/>
+      </w:pPr>
+    </w:lvl>
+    <w:lvl w:ilvl="5" w:tplc="0409001B" w:tentative="1">
+      <w:start w:val="1"/>
+      <w:numFmt w:val="lowerRoman"/>
+      <w:lvlText w:val="%6."/>
+      <w:lvlJc w:val="right"/>
+      <w:pPr>
+        <w:ind w:left="4320" w:hanging="180"/>
+      </w:pPr>
+    </w:lvl>
+    <w:lvl w:ilvl="6" w:tplc="0409000F" w:tentative="1">
+      <w:start w:val="1"/>
+      <w:numFmt w:val="decimal"/>
+      <w:lvlText w:val="%7."/>
+      <w:lvlJc w:val="left"/>
+      <w:pPr>
+        <w:ind w:left="5040" w:hanging="360"/>
+      </w:pPr>
+    </w:lvl>
+    <w:lvl w:ilvl="7" w:tplc="04090019" w:tentative="1">
+      <w:start w:val="1"/>
+      <w:numFmt w:val="lowerLetter"/>
+      <w:lvlText w:val="%8."/>
+      <w:lvlJc w:val="left"/>
+      <w:pPr>
+        <w:ind w:left="5760" w:hanging="360"/>
+      </w:pPr>
+    </w:lvl>
+    <w:lvl w:ilvl="8" w:tplc="0409001B" w:tentative="1">
+      <w:start w:val="1"/>
+      <w:numFmt w:val="lowerRoman"/>
+      <w:lvlText w:val="%9."/>
+      <w:lvlJc w:val="right"/>
+      <w:pPr>
+        <w:ind w:left="6480" w:hanging="180"/>
+      </w:pPr>
+    </w:lvl>
+  </w:abstractNum>
+  <w:abstractNum w:abstractNumId="10" w15:restartNumberingAfterBreak="0">
     <w:nsid w:val="34B41B70"/>
     <w:multiLevelType w:val="hybridMultilevel"/>
     <w:tmpl w:val="F190E03C"/>
@@ -4583,7 +4859,7 @@
       </w:pPr>
     </w:lvl>
   </w:abstractNum>
-  <w:abstractNum w:abstractNumId="9" w15:restartNumberingAfterBreak="0">
+  <w:abstractNum w:abstractNumId="11" w15:restartNumberingAfterBreak="0">
     <w:nsid w:val="3AD537C9"/>
     <w:multiLevelType w:val="hybridMultilevel"/>
     <w:tmpl w:val="8C703CBE"/>
@@ -4669,7 +4945,7 @@
       </w:pPr>
     </w:lvl>
   </w:abstractNum>
-  <w:abstractNum w:abstractNumId="10" w15:restartNumberingAfterBreak="0">
+  <w:abstractNum w:abstractNumId="12" w15:restartNumberingAfterBreak="0">
     <w:nsid w:val="3BDD4041"/>
     <w:multiLevelType w:val="hybridMultilevel"/>
     <w:tmpl w:val="938AABD4"/>
@@ -4755,7 +5031,7 @@
       </w:pPr>
     </w:lvl>
   </w:abstractNum>
-  <w:abstractNum w:abstractNumId="11" w15:restartNumberingAfterBreak="0">
+  <w:abstractNum w:abstractNumId="13" w15:restartNumberingAfterBreak="0">
     <w:nsid w:val="469F12F1"/>
     <w:multiLevelType w:val="hybridMultilevel"/>
     <w:tmpl w:val="BE3A4A38"/>
@@ -4841,7 +5117,7 @@
       </w:pPr>
     </w:lvl>
   </w:abstractNum>
-  <w:abstractNum w:abstractNumId="12" w15:restartNumberingAfterBreak="0">
+  <w:abstractNum w:abstractNumId="14" w15:restartNumberingAfterBreak="0">
     <w:nsid w:val="47070FF2"/>
     <w:multiLevelType w:val="hybridMultilevel"/>
     <w:tmpl w:val="92BE0E70"/>
@@ -4927,7 +5203,7 @@
       </w:pPr>
     </w:lvl>
   </w:abstractNum>
-  <w:abstractNum w:abstractNumId="13" w15:restartNumberingAfterBreak="0">
+  <w:abstractNum w:abstractNumId="15" w15:restartNumberingAfterBreak="0">
     <w:nsid w:val="4BB6382C"/>
     <w:multiLevelType w:val="hybridMultilevel"/>
     <w:tmpl w:val="9C4EEE4E"/>
@@ -5139,7 +5415,7 @@
       </w:rPr>
     </w:lvl>
   </w:abstractNum>
-  <w:abstractNum w:abstractNumId="14" w15:restartNumberingAfterBreak="0">
+  <w:abstractNum w:abstractNumId="16" w15:restartNumberingAfterBreak="0">
     <w:nsid w:val="5FE80C48"/>
     <w:multiLevelType w:val="hybridMultilevel"/>
     <w:tmpl w:val="938AABD4"/>
@@ -5225,7 +5501,7 @@
       </w:pPr>
     </w:lvl>
   </w:abstractNum>
-  <w:abstractNum w:abstractNumId="15" w15:restartNumberingAfterBreak="0">
+  <w:abstractNum w:abstractNumId="17" w15:restartNumberingAfterBreak="0">
     <w:nsid w:val="66CA1CA8"/>
     <w:multiLevelType w:val="hybridMultilevel"/>
     <w:tmpl w:val="938AABD4"/>
@@ -5311,7 +5587,7 @@
       </w:pPr>
     </w:lvl>
   </w:abstractNum>
-  <w:abstractNum w:abstractNumId="16" w15:restartNumberingAfterBreak="0">
+  <w:abstractNum w:abstractNumId="18" w15:restartNumberingAfterBreak="0">
     <w:nsid w:val="6E644FDE"/>
     <w:multiLevelType w:val="hybridMultilevel"/>
     <w:tmpl w:val="90B84B6A"/>
@@ -5523,7 +5799,7 @@
       </w:rPr>
     </w:lvl>
   </w:abstractNum>
-  <w:abstractNum w:abstractNumId="17" w15:restartNumberingAfterBreak="0">
+  <w:abstractNum w:abstractNumId="19" w15:restartNumberingAfterBreak="0">
     <w:nsid w:val="6F2F2E51"/>
     <w:multiLevelType w:val="hybridMultilevel"/>
     <w:tmpl w:val="06C4EE96"/>
@@ -5609,7 +5885,7 @@
       </w:pPr>
     </w:lvl>
   </w:abstractNum>
-  <w:abstractNum w:abstractNumId="18" w15:restartNumberingAfterBreak="0">
+  <w:abstractNum w:abstractNumId="20" w15:restartNumberingAfterBreak="0">
     <w:nsid w:val="7C3C6C10"/>
     <w:multiLevelType w:val="hybridMultilevel"/>
     <w:tmpl w:val="51FEFFF2"/>
@@ -5700,7 +5976,7 @@
     </w:lvl>
   </w:abstractNum>
   <w:num w:numId="1" w16cid:durableId="1346252963">
-    <w:abstractNumId w:val="13"/>
+    <w:abstractNumId w:val="15"/>
   </w:num>
   <w:num w:numId="2" w16cid:durableId="1109547417">
     <w:abstractNumId w:val="0"/>
@@ -5712,55 +5988,61 @@
     <w:abstractNumId w:val="4"/>
   </w:num>
   <w:num w:numId="5" w16cid:durableId="605969874">
-    <w:abstractNumId w:val="5"/>
+    <w:abstractNumId w:val="6"/>
   </w:num>
   <w:num w:numId="6" w16cid:durableId="89594695">
-    <w:abstractNumId w:val="16"/>
+    <w:abstractNumId w:val="18"/>
   </w:num>
   <w:num w:numId="7" w16cid:durableId="1223519224">
-    <w:abstractNumId w:val="6"/>
+    <w:abstractNumId w:val="7"/>
   </w:num>
   <w:num w:numId="8" w16cid:durableId="623386508">
-    <w:abstractNumId w:val="18"/>
+    <w:abstractNumId w:val="20"/>
   </w:num>
   <w:num w:numId="9" w16cid:durableId="728696453">
+    <w:abstractNumId w:val="10"/>
+  </w:num>
+  <w:num w:numId="10" w16cid:durableId="678313118">
+    <w:abstractNumId w:val="11"/>
+  </w:num>
+  <w:num w:numId="11" w16cid:durableId="1348631329">
+    <w:abstractNumId w:val="19"/>
+  </w:num>
+  <w:num w:numId="12" w16cid:durableId="1870021453">
     <w:abstractNumId w:val="8"/>
   </w:num>
-  <w:num w:numId="10" w16cid:durableId="678313118">
-    <w:abstractNumId w:val="9"/>
-  </w:num>
-  <w:num w:numId="11" w16cid:durableId="1348631329">
-    <w:abstractNumId w:val="17"/>
-  </w:num>
-  <w:num w:numId="12" w16cid:durableId="1870021453">
-    <w:abstractNumId w:val="7"/>
-  </w:num>
   <w:num w:numId="13" w16cid:durableId="2053186443">
-    <w:abstractNumId w:val="10"/>
+    <w:abstractNumId w:val="12"/>
   </w:num>
   <w:num w:numId="14" w16cid:durableId="1726828971">
-    <w:abstractNumId w:val="14"/>
+    <w:abstractNumId w:val="16"/>
   </w:num>
   <w:num w:numId="15" w16cid:durableId="1701856754">
     <w:abstractNumId w:val="2"/>
   </w:num>
   <w:num w:numId="16" w16cid:durableId="630328915">
-    <w:abstractNumId w:val="11"/>
+    <w:abstractNumId w:val="13"/>
   </w:num>
   <w:num w:numId="17" w16cid:durableId="336225780">
     <w:abstractNumId w:val="1"/>
   </w:num>
   <w:num w:numId="18" w16cid:durableId="1495804972">
-    <w:abstractNumId w:val="12"/>
+    <w:abstractNumId w:val="14"/>
   </w:num>
   <w:num w:numId="19" w16cid:durableId="333460535">
-    <w:abstractNumId w:val="15"/>
+    <w:abstractNumId w:val="17"/>
+  </w:num>
+  <w:num w:numId="20" w16cid:durableId="2091272820">
+    <w:abstractNumId w:val="9"/>
+  </w:num>
+  <w:num w:numId="21" w16cid:durableId="998733702">
+    <w:abstractNumId w:val="5"/>
   </w:num>
 </w:numbering>
 </file>
 
 <file path=word/styles.xml><?xml version="1.0" encoding="utf-8"?>
-<w:styles xmlns:mc="http://schemas.openxmlformats.org/markup-compatibility/2006" xmlns:r="http://schemas.openxmlformats.org/officeDocument/2006/relationships" xmlns:w="http://schemas.openxmlformats.org/wordprocessingml/2006/main" xmlns:w14="http://schemas.microsoft.com/office/word/2010/wordml" xmlns:w15="http://schemas.microsoft.com/office/word/2012/wordml" xmlns:w16cex="http://schemas.microsoft.com/office/word/2018/wordml/cex" xmlns:w16cid="http://schemas.microsoft.com/office/word/2016/wordml/cid" xmlns:w16="http://schemas.microsoft.com/office/word/2018/wordml" xmlns:w16du="http://schemas.microsoft.com/office/word/2023/wordml/word16du" xmlns:w16sdtdh="http://schemas.microsoft.com/office/word/2020/wordml/sdtdatahash" xmlns:w16se="http://schemas.microsoft.com/office/word/2015/wordml/symex" mc:Ignorable="w14 w15 w16se w16cid w16 w16cex w16sdtdh w16du">
+<w:styles xmlns:mc="http://schemas.openxmlformats.org/markup-compatibility/2006" xmlns:r="http://schemas.openxmlformats.org/officeDocument/2006/relationships" xmlns:w="http://schemas.openxmlformats.org/wordprocessingml/2006/main" xmlns:w14="http://schemas.microsoft.com/office/word/2010/wordml" xmlns:w15="http://schemas.microsoft.com/office/word/2012/wordml" xmlns:w16cex="http://schemas.microsoft.com/office/word/2018/wordml/cex" xmlns:w16cid="http://schemas.microsoft.com/office/word/2016/wordml/cid" xmlns:w16="http://schemas.microsoft.com/office/word/2018/wordml" xmlns:w16du="http://schemas.microsoft.com/office/word/2023/wordml/word16du" xmlns:w16sdtdh="http://schemas.microsoft.com/office/word/2020/wordml/sdtdatahash" xmlns:w16sdtfl="http://schemas.microsoft.com/office/word/2024/wordml/sdtformatlock" xmlns:w16se="http://schemas.microsoft.com/office/word/2015/wordml/symex" mc:Ignorable="w14 w15 w16se w16cid w16 w16cex w16sdtdh w16sdtfl w16du">
   <w:docDefaults>
     <w:rPrDefault>
       <w:rPr>
@@ -6234,7 +6516,6 @@
   <w:style w:type="character" w:default="1" w:styleId="Fuentedeprrafopredeter">
     <w:name w:val="Default Paragraph Font"/>
     <w:uiPriority w:val="1"/>
-    <w:semiHidden/>
     <w:unhideWhenUsed/>
   </w:style>
   <w:style w:type="table" w:default="1" w:styleId="Tablanormal">

</xml_diff>